<commit_message>
Updated errata list for piece 7
</commit_message>
<xml_diff>
--- a/Working Folder/7 Gordon Fung 冯迪伦 - Arise, You Lion of Glory! 狮舞弄清韻/7 Gordon Fung 冯迪伦 - Arise, You Lion of Glory! 狮舞弄清韻 - Errata_v1.docx
+++ b/Working Folder/7 Gordon Fung 冯迪伦 - Arise, You Lion of Glory! 狮舞弄清韻/7 Gordon Fung 冯迪伦 - Arise, You Lion of Glory! 狮舞弄清韻 - Errata_v1.docx
@@ -284,7 +284,27 @@
           <w:sz w:val="32"/>
           <w:szCs w:val="32"/>
         </w:rPr>
-        <w:t xml:space="preserve">Font and format changes, including use of small time signatures, as agreed by SCO. </w:t>
+        <w:t xml:space="preserve">Font and format changes, including use of </w:t>
+      </w:r>
+      <w:proofErr w:type="gramStart"/>
+      <w:r>
+        <w:rPr>
+          <w:rFonts w:ascii="Times" w:eastAsia="Times" w:hAnsi="Times" w:cs="Times"/>
+          <w:bCs/>
+          <w:sz w:val="32"/>
+          <w:szCs w:val="32"/>
+        </w:rPr>
+        <w:t>small time</w:t>
+      </w:r>
+      <w:proofErr w:type="gramEnd"/>
+      <w:r>
+        <w:rPr>
+          <w:rFonts w:ascii="Times" w:eastAsia="Times" w:hAnsi="Times" w:cs="Times"/>
+          <w:bCs/>
+          <w:sz w:val="32"/>
+          <w:szCs w:val="32"/>
+        </w:rPr>
+        <w:t xml:space="preserve"> signatures, as agreed by SCO. </w:t>
       </w:r>
       <w:r>
         <w:rPr>
@@ -842,8 +862,17 @@
                 <w:rFonts w:ascii="Times New Roman" w:hAnsi="Times New Roman" w:cs="Times New Roman"/>
                 <w:lang w:eastAsia="zh-TW"/>
               </w:rPr>
-              <w:t>雜聲吊鈸</w:t>
-            </w:r>
+              <w:t>雜聲吊</w:t>
+            </w:r>
+            <w:proofErr w:type="gramStart"/>
+            <w:r>
+              <w:rPr>
+                <w:rFonts w:ascii="Times New Roman" w:hAnsi="Times New Roman" w:cs="Times New Roman"/>
+                <w:lang w:eastAsia="zh-TW"/>
+              </w:rPr>
+              <w:t>鈸</w:t>
+            </w:r>
+            <w:proofErr w:type="gramEnd"/>
             <w:r>
               <w:rPr>
                 <w:rFonts w:ascii="Times New Roman" w:hAnsi="Times New Roman" w:cs="Times New Roman" w:hint="eastAsia"/>
@@ -870,8 +899,17 @@
                 <w:rFonts w:ascii="Times New Roman" w:hAnsi="Times New Roman" w:cs="Times New Roman"/>
                 <w:lang w:eastAsia="zh-TW"/>
               </w:rPr>
-              <w:t>雜聲吊鈸</w:t>
-            </w:r>
+              <w:t>雜聲吊</w:t>
+            </w:r>
+            <w:proofErr w:type="gramStart"/>
+            <w:r>
+              <w:rPr>
+                <w:rFonts w:ascii="Times New Roman" w:hAnsi="Times New Roman" w:cs="Times New Roman"/>
+                <w:lang w:eastAsia="zh-TW"/>
+              </w:rPr>
+              <w:t>鈸</w:t>
+            </w:r>
+            <w:proofErr w:type="gramEnd"/>
             <w:r>
               <w:rPr>
                 <w:rFonts w:ascii="Times New Roman" w:hAnsi="Times New Roman" w:cs="Times New Roman"/>
@@ -990,7 +1028,14 @@
               <w:rPr>
                 <w:rFonts w:ascii="Times" w:eastAsia="Times" w:hAnsi="Times" w:cs="Times"/>
               </w:rPr>
-              <w:t>ibraslap is</w:t>
+              <w:t xml:space="preserve">ibraslap </w:t>
+            </w:r>
+            <w:proofErr w:type="gramStart"/>
+            <w:r>
+              <w:rPr>
+                <w:rFonts w:ascii="Times" w:eastAsia="Times" w:hAnsi="Times" w:cs="Times"/>
+              </w:rPr>
+              <w:t>is</w:t>
             </w:r>
             <w:r>
               <w:rPr>
@@ -1002,7 +1047,14 @@
               <w:rPr>
                 <w:rFonts w:ascii="Times" w:eastAsia="Times" w:hAnsi="Times" w:cs="Times"/>
               </w:rPr>
-              <w:t>, but score names them</w:t>
+              <w:t>, but</w:t>
+            </w:r>
+            <w:proofErr w:type="gramEnd"/>
+            <w:r>
+              <w:rPr>
+                <w:rFonts w:ascii="Times" w:eastAsia="Times" w:hAnsi="Times" w:cs="Times"/>
+              </w:rPr>
+              <w:t xml:space="preserve"> score names them</w:t>
             </w:r>
             <w:r>
               <w:rPr>
@@ -1040,6 +1092,7 @@
             <w:r>
               <w:rPr>
                 <w:rFonts w:ascii="Times" w:eastAsia="Times" w:hAnsi="Times" w:cs="Times"/>
+                <w:lang w:eastAsia="zh-TW"/>
               </w:rPr>
               <w:lastRenderedPageBreak/>
               <w:t xml:space="preserve">SCO </w:t>
@@ -1047,90 +1100,105 @@
             <w:r>
               <w:rPr>
                 <w:rFonts w:asciiTheme="minorEastAsia" w:eastAsiaTheme="minorEastAsia" w:hAnsiTheme="minorEastAsia" w:cs="Times" w:hint="eastAsia"/>
+                <w:lang w:eastAsia="zh-TW"/>
               </w:rPr>
               <w:t>“</w:t>
             </w:r>
             <w:r>
               <w:rPr>
                 <w:rFonts w:ascii="Times" w:eastAsiaTheme="minorEastAsia" w:hAnsi="Times" w:cs="Times" w:hint="eastAsia"/>
+                <w:lang w:eastAsia="zh-TW"/>
               </w:rPr>
               <w:t>Vibraslap</w:t>
             </w:r>
             <w:r>
               <w:rPr>
                 <w:rFonts w:ascii="Times" w:eastAsiaTheme="minorEastAsia" w:hAnsi="Times" w:cs="Times" w:hint="eastAsia"/>
+                <w:lang w:eastAsia="zh-TW"/>
               </w:rPr>
               <w:t>”</w:t>
             </w:r>
             <w:r>
               <w:rPr>
                 <w:rFonts w:ascii="Times" w:eastAsiaTheme="minorEastAsia" w:hAnsi="Times" w:cs="Times" w:hint="eastAsia"/>
+                <w:lang w:eastAsia="zh-TW"/>
               </w:rPr>
               <w:t xml:space="preserve"> </w:t>
             </w:r>
             <w:r>
               <w:rPr>
                 <w:rFonts w:ascii="SimSun" w:hAnsi="SimSun" w:cs="Times" w:hint="eastAsia"/>
+                <w:lang w:eastAsia="zh-TW"/>
               </w:rPr>
               <w:t>翻譯</w:t>
             </w:r>
             <w:r>
               <w:rPr>
                 <w:rFonts w:ascii="SimSun" w:hAnsi="SimSun" w:cs="SimSun" w:hint="eastAsia"/>
+                <w:lang w:eastAsia="zh-TW"/>
               </w:rPr>
               <w:t>推薦</w:t>
             </w:r>
             <w:r>
               <w:rPr>
                 <w:rFonts w:ascii="SimSun" w:hAnsi="SimSun" w:cs="Times" w:hint="eastAsia"/>
+                <w:lang w:eastAsia="zh-TW"/>
               </w:rPr>
               <w:t>是《</w:t>
             </w:r>
             <w:r>
               <w:rPr>
                 <w:rFonts w:ascii="SimSun" w:hAnsi="SimSun" w:cs="SimSun" w:hint="eastAsia"/>
+                <w:lang w:eastAsia="zh-TW"/>
               </w:rPr>
               <w:t>拍顫器》</w:t>
             </w:r>
             <w:r>
               <w:rPr>
                 <w:rFonts w:ascii="SimSun" w:hAnsi="SimSun" w:cs="SimSun" w:hint="eastAsia"/>
+                <w:lang w:eastAsia="zh-TW"/>
               </w:rPr>
               <w:t>,</w:t>
             </w:r>
             <w:r>
               <w:rPr>
                 <w:rFonts w:hint="eastAsia"/>
+                <w:lang w:eastAsia="zh-TW"/>
               </w:rPr>
               <w:t xml:space="preserve"> </w:t>
             </w:r>
             <w:r>
               <w:rPr>
                 <w:rFonts w:ascii="SimSun" w:hAnsi="SimSun" w:cs="SimSun" w:hint="eastAsia"/>
+                <w:lang w:eastAsia="zh-TW"/>
               </w:rPr>
               <w:t>不過</w:t>
             </w:r>
             <w:r>
               <w:rPr>
                 <w:rFonts w:ascii="SimSun" w:hAnsi="SimSun" w:cs="SimSun" w:hint="eastAsia"/>
+                <w:lang w:eastAsia="zh-TW"/>
               </w:rPr>
               <w:t>目前樂譜</w:t>
             </w:r>
             <w:r>
               <w:rPr>
                 <w:rFonts w:ascii="SimSun" w:hAnsi="SimSun" w:cs="SimSun" w:hint="eastAsia"/>
+                <w:lang w:eastAsia="zh-TW"/>
               </w:rPr>
               <w:t>寫的是《</w:t>
             </w:r>
             <w:r>
               <w:rPr>
                 <w:rFonts w:ascii="SimSun" w:hAnsi="SimSun" w:cs="SimSun" w:hint="eastAsia"/>
+                <w:lang w:eastAsia="zh-TW"/>
               </w:rPr>
               <w:t>彈簧匣</w:t>
             </w:r>
             <w:r>
               <w:rPr>
                 <w:rFonts w:ascii="SimSun" w:hAnsi="SimSun" w:cs="SimSun" w:hint="eastAsia"/>
+                <w:lang w:eastAsia="zh-TW"/>
               </w:rPr>
               <w:t>》。</w:t>
             </w:r>
@@ -1227,7 +1295,23 @@
                 <w:rFonts w:ascii="Times" w:eastAsia="Times" w:hAnsi="Times" w:cs="Times"/>
                 <w:lang w:eastAsia="zh-TW"/>
               </w:rPr>
-              <w:t>Tempo 60 = tuplet?</w:t>
+              <w:t xml:space="preserve">Tempo 60 = </w:t>
+            </w:r>
+            <w:proofErr w:type="spellStart"/>
+            <w:r>
+              <w:rPr>
+                <w:rFonts w:ascii="Times" w:eastAsia="Times" w:hAnsi="Times" w:cs="Times"/>
+                <w:lang w:eastAsia="zh-TW"/>
+              </w:rPr>
+              <w:t>tuplet</w:t>
+            </w:r>
+            <w:proofErr w:type="spellEnd"/>
+            <w:r>
+              <w:rPr>
+                <w:rFonts w:ascii="Times" w:eastAsia="Times" w:hAnsi="Times" w:cs="Times"/>
+                <w:lang w:eastAsia="zh-TW"/>
+              </w:rPr>
+              <w:t>?</w:t>
             </w:r>
           </w:p>
         </w:tc>
@@ -1288,6 +1372,12 @@
               </w:rPr>
               <w:t>Perc 3-6</w:t>
             </w:r>
+            <w:r>
+              <w:rPr>
+                <w:rFonts w:ascii="Times" w:eastAsiaTheme="minorEastAsia" w:hAnsi="Times" w:cs="Times"/>
+              </w:rPr>
+              <w:t xml:space="preserve"> </w:t>
+            </w:r>
           </w:p>
         </w:tc>
         <w:tc>
@@ -1304,7 +1394,55 @@
               <w:rPr>
                 <w:rFonts w:ascii="Times" w:eastAsiaTheme="minorEastAsia" w:hAnsi="Times" w:cs="Times" w:hint="eastAsia"/>
               </w:rPr>
-              <w:t>Windchimes and Glasschimes are not listed in the instrument list.</w:t>
+              <w:t xml:space="preserve">Windchimes and </w:t>
+            </w:r>
+            <w:proofErr w:type="spellStart"/>
+            <w:r>
+              <w:rPr>
+                <w:rFonts w:ascii="Times" w:eastAsiaTheme="minorEastAsia" w:hAnsi="Times" w:cs="Times" w:hint="eastAsia"/>
+              </w:rPr>
+              <w:t>Glasschimes</w:t>
+            </w:r>
+            <w:proofErr w:type="spellEnd"/>
+            <w:r>
+              <w:rPr>
+                <w:rFonts w:ascii="Times" w:eastAsiaTheme="minorEastAsia" w:hAnsi="Times" w:cs="Times" w:hint="eastAsia"/>
+              </w:rPr>
+              <w:t xml:space="preserve"> are not listed in the instrument list.</w:t>
+            </w:r>
+          </w:p>
+          <w:p>
+            <w:pPr>
+              <w:rPr>
+                <w:rFonts w:ascii="Times" w:eastAsiaTheme="minorEastAsia" w:hAnsi="Times" w:cs="Times"/>
+              </w:rPr>
+            </w:pPr>
+          </w:p>
+          <w:p>
+            <w:pPr>
+              <w:rPr>
+                <w:rFonts w:ascii="Times" w:eastAsiaTheme="minorEastAsia" w:hAnsi="Times" w:cs="Times"/>
+              </w:rPr>
+            </w:pPr>
+            <w:r>
+              <w:rPr>
+                <w:rFonts w:ascii="Times" w:eastAsiaTheme="minorEastAsia" w:hAnsi="Times" w:cs="Times"/>
+              </w:rPr>
+              <w:t xml:space="preserve">Likewise, is </w:t>
+            </w:r>
+            <w:proofErr w:type="spellStart"/>
+            <w:r>
+              <w:rPr>
+                <w:rFonts w:ascii="Times" w:eastAsiaTheme="minorEastAsia" w:hAnsi="Times" w:cs="Times"/>
+              </w:rPr>
+              <w:t>glasschime</w:t>
+            </w:r>
+            <w:proofErr w:type="spellEnd"/>
+            <w:r>
+              <w:rPr>
+                <w:rFonts w:ascii="Times" w:eastAsiaTheme="minorEastAsia" w:hAnsi="Times" w:cs="Times"/>
+              </w:rPr>
+              <w:t xml:space="preserve"> and windchime the same instrument? </w:t>
             </w:r>
           </w:p>
         </w:tc>

</xml_diff>

<commit_message>
Editing collisions and replaced dangling tie notes with LV. More space adjustments needed.
</commit_message>
<xml_diff>
--- a/Working Folder/7 Gordon Fung 冯迪伦 - Arise, You Lion of Glory! 狮舞弄清韻/7 Gordon Fung 冯迪伦 - Arise, You Lion of Glory! 狮舞弄清韻 - Errata_v1.docx
+++ b/Working Folder/7 Gordon Fung 冯迪伦 - Arise, You Lion of Glory! 狮舞弄清韻/7 Gordon Fung 冯迪伦 - Arise, You Lion of Glory! 狮舞弄清韻 - Errata_v1.docx
@@ -1312,6 +1312,91 @@
                 <w:lang w:eastAsia="zh-TW"/>
               </w:rPr>
               <w:t>?</w:t>
+            </w:r>
+          </w:p>
+        </w:tc>
+        <w:tc>
+          <w:tcPr>
+            <w:tcW w:w="2994" w:type="dxa"/>
+            <w:vAlign w:val="center"/>
+          </w:tcPr>
+          <w:p>
+            <w:pPr>
+              <w:jc w:val="center"/>
+              <w:rPr>
+                <w:rFonts w:ascii="Times" w:eastAsia="Times" w:hAnsi="Times" w:cs="Times"/>
+                <w:color w:val="FF0000"/>
+                <w:lang w:eastAsia="zh-TW"/>
+              </w:rPr>
+            </w:pPr>
+          </w:p>
+        </w:tc>
+      </w:tr>
+      <w:tr>
+        <w:trPr>
+          <w:trHeight w:val="552"/>
+        </w:trPr>
+        <w:tc>
+          <w:tcPr>
+            <w:tcW w:w="1129" w:type="dxa"/>
+          </w:tcPr>
+          <w:p>
+            <w:pPr>
+              <w:jc w:val="center"/>
+              <w:rPr>
+                <w:rFonts w:ascii="Times" w:eastAsiaTheme="minorEastAsia" w:hAnsi="Times" w:cs="Times" w:hint="eastAsia"/>
+              </w:rPr>
+            </w:pPr>
+            <w:r>
+              <w:rPr>
+                <w:rFonts w:ascii="Times" w:eastAsiaTheme="minorEastAsia" w:hAnsi="Times" w:cs="Times"/>
+              </w:rPr>
+              <w:t>173</w:t>
+            </w:r>
+          </w:p>
+        </w:tc>
+        <w:tc>
+          <w:tcPr>
+            <w:tcW w:w="1985" w:type="dxa"/>
+          </w:tcPr>
+          <w:p>
+            <w:pPr>
+              <w:jc w:val="center"/>
+              <w:rPr>
+                <w:rFonts w:ascii="Times" w:eastAsiaTheme="minorEastAsia" w:hAnsi="Times" w:cs="Times" w:hint="eastAsia"/>
+              </w:rPr>
+            </w:pPr>
+            <w:proofErr w:type="spellStart"/>
+            <w:r>
+              <w:rPr>
+                <w:rFonts w:ascii="Times" w:eastAsiaTheme="minorEastAsia" w:hAnsi="Times" w:cs="Times"/>
+              </w:rPr>
+              <w:t>Gaoruan</w:t>
+            </w:r>
+            <w:proofErr w:type="spellEnd"/>
+            <w:r>
+              <w:rPr>
+                <w:rFonts w:ascii="Times" w:eastAsiaTheme="minorEastAsia" w:hAnsi="Times" w:cs="Times"/>
+              </w:rPr>
+              <w:t xml:space="preserve"> GR</w:t>
+            </w:r>
+          </w:p>
+        </w:tc>
+        <w:tc>
+          <w:tcPr>
+            <w:tcW w:w="2977" w:type="dxa"/>
+          </w:tcPr>
+          <w:p>
+            <w:pPr>
+              <w:rPr>
+                <w:rFonts w:ascii="Times" w:eastAsiaTheme="minorEastAsia" w:hAnsi="Times" w:cs="Times" w:hint="eastAsia"/>
+              </w:rPr>
+            </w:pPr>
+            <w:r>
+              <w:rPr>
+                <w:rFonts w:ascii="Times" w:eastAsiaTheme="minorEastAsia" w:hAnsi="Times" w:cs="Times"/>
+              </w:rPr>
+              <w:t>Additional notes (G &amp; D). Is this correct?</w:t>
             </w:r>
           </w:p>
         </w:tc>

</xml_diff>

<commit_message>
Reduced ledgers lines in Pipa solo + minor formatting edits. To continue cleaning up Pipa solo. Also updated Errata list.
</commit_message>
<xml_diff>
--- a/Working Folder/7 Gordon Fung 冯迪伦 - Arise, You Lion of Glory! 狮舞弄清韻/7 Gordon Fung 冯迪伦 - Arise, You Lion of Glory! 狮舞弄清韻 - Errata_v1.docx
+++ b/Working Folder/7 Gordon Fung 冯迪伦 - Arise, You Lion of Glory! 狮舞弄清韻/7 Gordon Fung 冯迪伦 - Arise, You Lion of Glory! 狮舞弄清韻 - Errata_v1.docx
@@ -284,27 +284,7 @@
           <w:sz w:val="32"/>
           <w:szCs w:val="32"/>
         </w:rPr>
-        <w:t xml:space="preserve">Font and format changes, including use of </w:t>
-      </w:r>
-      <w:proofErr w:type="gramStart"/>
-      <w:r>
-        <w:rPr>
-          <w:rFonts w:ascii="Times" w:eastAsia="Times" w:hAnsi="Times" w:cs="Times"/>
-          <w:bCs/>
-          <w:sz w:val="32"/>
-          <w:szCs w:val="32"/>
-        </w:rPr>
-        <w:t>small time</w:t>
-      </w:r>
-      <w:proofErr w:type="gramEnd"/>
-      <w:r>
-        <w:rPr>
-          <w:rFonts w:ascii="Times" w:eastAsia="Times" w:hAnsi="Times" w:cs="Times"/>
-          <w:bCs/>
-          <w:sz w:val="32"/>
-          <w:szCs w:val="32"/>
-        </w:rPr>
-        <w:t xml:space="preserve"> signatures, as agreed by SCO. </w:t>
+        <w:t xml:space="preserve">Font and format changes, including use of small time signatures, as agreed by SCO. </w:t>
       </w:r>
       <w:r>
         <w:rPr>
@@ -862,17 +842,8 @@
                 <w:rFonts w:ascii="Times New Roman" w:hAnsi="Times New Roman" w:cs="Times New Roman"/>
                 <w:lang w:eastAsia="zh-TW"/>
               </w:rPr>
-              <w:t>雜聲吊</w:t>
-            </w:r>
-            <w:proofErr w:type="gramStart"/>
-            <w:r>
-              <w:rPr>
-                <w:rFonts w:ascii="Times New Roman" w:hAnsi="Times New Roman" w:cs="Times New Roman"/>
-                <w:lang w:eastAsia="zh-TW"/>
-              </w:rPr>
-              <w:t>鈸</w:t>
-            </w:r>
-            <w:proofErr w:type="gramEnd"/>
+              <w:t>雜聲吊鈸</w:t>
+            </w:r>
             <w:r>
               <w:rPr>
                 <w:rFonts w:ascii="Times New Roman" w:hAnsi="Times New Roman" w:cs="Times New Roman" w:hint="eastAsia"/>
@@ -899,17 +870,8 @@
                 <w:rFonts w:ascii="Times New Roman" w:hAnsi="Times New Roman" w:cs="Times New Roman"/>
                 <w:lang w:eastAsia="zh-TW"/>
               </w:rPr>
-              <w:t>雜聲吊</w:t>
-            </w:r>
-            <w:proofErr w:type="gramStart"/>
-            <w:r>
-              <w:rPr>
-                <w:rFonts w:ascii="Times New Roman" w:hAnsi="Times New Roman" w:cs="Times New Roman"/>
-                <w:lang w:eastAsia="zh-TW"/>
-              </w:rPr>
-              <w:t>鈸</w:t>
-            </w:r>
-            <w:proofErr w:type="gramEnd"/>
+              <w:t>雜聲吊鈸</w:t>
+            </w:r>
             <w:r>
               <w:rPr>
                 <w:rFonts w:ascii="Times New Roman" w:hAnsi="Times New Roman" w:cs="Times New Roman"/>
@@ -1028,14 +990,7 @@
               <w:rPr>
                 <w:rFonts w:ascii="Times" w:eastAsia="Times" w:hAnsi="Times" w:cs="Times"/>
               </w:rPr>
-              <w:t xml:space="preserve">ibraslap </w:t>
-            </w:r>
-            <w:proofErr w:type="gramStart"/>
-            <w:r>
-              <w:rPr>
-                <w:rFonts w:ascii="Times" w:eastAsia="Times" w:hAnsi="Times" w:cs="Times"/>
-              </w:rPr>
-              <w:t>is</w:t>
+              <w:t>ibraslap is</w:t>
             </w:r>
             <w:r>
               <w:rPr>
@@ -1047,14 +1002,7 @@
               <w:rPr>
                 <w:rFonts w:ascii="Times" w:eastAsia="Times" w:hAnsi="Times" w:cs="Times"/>
               </w:rPr>
-              <w:t>, but</w:t>
-            </w:r>
-            <w:proofErr w:type="gramEnd"/>
-            <w:r>
-              <w:rPr>
-                <w:rFonts w:ascii="Times" w:eastAsia="Times" w:hAnsi="Times" w:cs="Times"/>
-              </w:rPr>
-              <w:t xml:space="preserve"> score names them</w:t>
+              <w:t>, but score names them</w:t>
             </w:r>
             <w:r>
               <w:rPr>
@@ -1344,13 +1292,13 @@
             <w:pPr>
               <w:jc w:val="center"/>
               <w:rPr>
-                <w:rFonts w:ascii="Times" w:eastAsiaTheme="minorEastAsia" w:hAnsi="Times" w:cs="Times" w:hint="eastAsia"/>
-              </w:rPr>
-            </w:pPr>
-            <w:r>
-              <w:rPr>
                 <w:rFonts w:ascii="Times" w:eastAsiaTheme="minorEastAsia" w:hAnsi="Times" w:cs="Times"/>
               </w:rPr>
+            </w:pPr>
+            <w:r>
+              <w:rPr>
+                <w:rFonts w:ascii="Times" w:eastAsiaTheme="minorEastAsia" w:hAnsi="Times" w:cs="Times"/>
+              </w:rPr>
               <w:t>173</w:t>
             </w:r>
           </w:p>
@@ -1363,7 +1311,7 @@
             <w:pPr>
               <w:jc w:val="center"/>
               <w:rPr>
-                <w:rFonts w:ascii="Times" w:eastAsiaTheme="minorEastAsia" w:hAnsi="Times" w:cs="Times" w:hint="eastAsia"/>
+                <w:rFonts w:ascii="Times" w:eastAsiaTheme="minorEastAsia" w:hAnsi="Times" w:cs="Times"/>
               </w:rPr>
             </w:pPr>
             <w:proofErr w:type="spellStart"/>
@@ -1389,7 +1337,7 @@
           <w:p>
             <w:pPr>
               <w:rPr>
-                <w:rFonts w:ascii="Times" w:eastAsiaTheme="minorEastAsia" w:hAnsi="Times" w:cs="Times" w:hint="eastAsia"/>
+                <w:rFonts w:ascii="Times" w:eastAsiaTheme="minorEastAsia" w:hAnsi="Times" w:cs="Times"/>
               </w:rPr>
             </w:pPr>
             <w:r>
@@ -1564,6 +1512,13 @@
                 <w:lang w:eastAsia="zh-TW"/>
               </w:rPr>
             </w:pPr>
+            <w:r>
+              <w:rPr>
+                <w:rFonts w:ascii="Times" w:eastAsia="Times" w:hAnsi="Times" w:cs="Times"/>
+                <w:lang w:eastAsia="zh-TW"/>
+              </w:rPr>
+              <w:t>188-234</w:t>
+            </w:r>
           </w:p>
         </w:tc>
         <w:tc>
@@ -1578,6 +1533,13 @@
                 <w:lang w:eastAsia="zh-TW"/>
               </w:rPr>
             </w:pPr>
+            <w:r>
+              <w:rPr>
+                <w:rFonts w:ascii="Times" w:eastAsia="Times" w:hAnsi="Times" w:cs="Times"/>
+                <w:lang w:eastAsia="zh-TW"/>
+              </w:rPr>
+              <w:t>Pipa Solo</w:t>
+            </w:r>
           </w:p>
         </w:tc>
         <w:tc>
@@ -1591,6 +1553,13 @@
                 <w:lang w:eastAsia="zh-TW"/>
               </w:rPr>
             </w:pPr>
+            <w:r>
+              <w:rPr>
+                <w:rFonts w:ascii="Times" w:eastAsia="Times" w:hAnsi="Times" w:cs="Times"/>
+                <w:lang w:eastAsia="zh-TW"/>
+              </w:rPr>
+              <w:t xml:space="preserve">Replaced excessive ledger lines with alternative scoring solutions to make it easier to read. </w:t>
+            </w:r>
           </w:p>
         </w:tc>
         <w:tc>

</xml_diff>

<commit_message>
Edited more Pipa Solo parts. Adjusted natural harmonics on strings. Other minor edits.
</commit_message>
<xml_diff>
--- a/Working Folder/7 Gordon Fung 冯迪伦 - Arise, You Lion of Glory! 狮舞弄清韻/7 Gordon Fung 冯迪伦 - Arise, You Lion of Glory! 狮舞弄清韻 - Errata_v1.docx
+++ b/Working Folder/7 Gordon Fung 冯迪伦 - Arise, You Lion of Glory! 狮舞弄清韻/7 Gordon Fung 冯迪伦 - Arise, You Lion of Glory! 狮舞弄清韻 - Errata_v1.docx
@@ -284,7 +284,27 @@
           <w:sz w:val="32"/>
           <w:szCs w:val="32"/>
         </w:rPr>
-        <w:t xml:space="preserve">Font and format changes, including use of small time signatures, as agreed by SCO. </w:t>
+        <w:t xml:space="preserve">Font and format changes, including use of </w:t>
+      </w:r>
+      <w:proofErr w:type="gramStart"/>
+      <w:r>
+        <w:rPr>
+          <w:rFonts w:ascii="Times" w:eastAsia="Times" w:hAnsi="Times" w:cs="Times"/>
+          <w:bCs/>
+          <w:sz w:val="32"/>
+          <w:szCs w:val="32"/>
+        </w:rPr>
+        <w:t>small time</w:t>
+      </w:r>
+      <w:proofErr w:type="gramEnd"/>
+      <w:r>
+        <w:rPr>
+          <w:rFonts w:ascii="Times" w:eastAsia="Times" w:hAnsi="Times" w:cs="Times"/>
+          <w:bCs/>
+          <w:sz w:val="32"/>
+          <w:szCs w:val="32"/>
+        </w:rPr>
+        <w:t xml:space="preserve"> signatures, as agreed by SCO. </w:t>
       </w:r>
       <w:r>
         <w:rPr>
@@ -842,8 +862,17 @@
                 <w:rFonts w:ascii="Times New Roman" w:hAnsi="Times New Roman" w:cs="Times New Roman"/>
                 <w:lang w:eastAsia="zh-TW"/>
               </w:rPr>
-              <w:t>雜聲吊鈸</w:t>
-            </w:r>
+              <w:t>雜聲吊</w:t>
+            </w:r>
+            <w:proofErr w:type="gramStart"/>
+            <w:r>
+              <w:rPr>
+                <w:rFonts w:ascii="Times New Roman" w:hAnsi="Times New Roman" w:cs="Times New Roman"/>
+                <w:lang w:eastAsia="zh-TW"/>
+              </w:rPr>
+              <w:t>鈸</w:t>
+            </w:r>
+            <w:proofErr w:type="gramEnd"/>
             <w:r>
               <w:rPr>
                 <w:rFonts w:ascii="Times New Roman" w:hAnsi="Times New Roman" w:cs="Times New Roman" w:hint="eastAsia"/>
@@ -870,8 +899,17 @@
                 <w:rFonts w:ascii="Times New Roman" w:hAnsi="Times New Roman" w:cs="Times New Roman"/>
                 <w:lang w:eastAsia="zh-TW"/>
               </w:rPr>
-              <w:t>雜聲吊鈸</w:t>
-            </w:r>
+              <w:t>雜聲吊</w:t>
+            </w:r>
+            <w:proofErr w:type="gramStart"/>
+            <w:r>
+              <w:rPr>
+                <w:rFonts w:ascii="Times New Roman" w:hAnsi="Times New Roman" w:cs="Times New Roman"/>
+                <w:lang w:eastAsia="zh-TW"/>
+              </w:rPr>
+              <w:t>鈸</w:t>
+            </w:r>
+            <w:proofErr w:type="gramEnd"/>
             <w:r>
               <w:rPr>
                 <w:rFonts w:ascii="Times New Roman" w:hAnsi="Times New Roman" w:cs="Times New Roman"/>
@@ -990,7 +1028,14 @@
               <w:rPr>
                 <w:rFonts w:ascii="Times" w:eastAsia="Times" w:hAnsi="Times" w:cs="Times"/>
               </w:rPr>
-              <w:t>ibraslap is</w:t>
+              <w:t xml:space="preserve">ibraslap </w:t>
+            </w:r>
+            <w:proofErr w:type="gramStart"/>
+            <w:r>
+              <w:rPr>
+                <w:rFonts w:ascii="Times" w:eastAsia="Times" w:hAnsi="Times" w:cs="Times"/>
+              </w:rPr>
+              <w:t>is</w:t>
             </w:r>
             <w:r>
               <w:rPr>
@@ -1002,7 +1047,14 @@
               <w:rPr>
                 <w:rFonts w:ascii="Times" w:eastAsia="Times" w:hAnsi="Times" w:cs="Times"/>
               </w:rPr>
-              <w:t>, but score names them</w:t>
+              <w:t>, but</w:t>
+            </w:r>
+            <w:proofErr w:type="gramEnd"/>
+            <w:r>
+              <w:rPr>
+                <w:rFonts w:ascii="Times" w:eastAsia="Times" w:hAnsi="Times" w:cs="Times"/>
+              </w:rPr>
+              <w:t xml:space="preserve"> score names them</w:t>
             </w:r>
             <w:r>
               <w:rPr>
@@ -1299,7 +1351,7 @@
               <w:rPr>
                 <w:rFonts w:ascii="Times" w:eastAsiaTheme="minorEastAsia" w:hAnsi="Times" w:cs="Times"/>
               </w:rPr>
-              <w:t>173</w:t>
+              <w:t>70</w:t>
             </w:r>
           </w:p>
         </w:tc>
@@ -1314,37 +1366,73 @@
                 <w:rFonts w:ascii="Times" w:eastAsiaTheme="minorEastAsia" w:hAnsi="Times" w:cs="Times"/>
               </w:rPr>
             </w:pPr>
+            <w:r>
+              <w:rPr>
+                <w:rFonts w:ascii="Times" w:eastAsiaTheme="minorEastAsia" w:hAnsi="Times" w:cs="Times"/>
+              </w:rPr>
+              <w:t>Pipa Solo</w:t>
+            </w:r>
+          </w:p>
+        </w:tc>
+        <w:tc>
+          <w:tcPr>
+            <w:tcW w:w="2977" w:type="dxa"/>
+          </w:tcPr>
+          <w:p>
+            <w:pPr>
+              <w:rPr>
+                <w:rFonts w:ascii="Times" w:eastAsiaTheme="minorEastAsia" w:hAnsi="Times" w:cs="Times"/>
+              </w:rPr>
+            </w:pPr>
+            <w:r>
+              <w:rPr>
+                <w:rFonts w:ascii="Times" w:eastAsiaTheme="minorEastAsia" w:hAnsi="Times" w:cs="Times"/>
+              </w:rPr>
+              <w:t>Should there be</w:t>
+            </w:r>
+            <w:r>
+              <w:rPr>
+                <w:rFonts w:ascii="Times" w:eastAsiaTheme="minorEastAsia" w:hAnsi="Times" w:cs="Times"/>
+                <w:i/>
+                <w:iCs/>
+              </w:rPr>
+              <w:t xml:space="preserve"> </w:t>
+            </w:r>
+            <w:proofErr w:type="gramStart"/>
+            <w:r>
+              <w:rPr>
+                <w:rFonts w:ascii="Times" w:eastAsiaTheme="minorEastAsia" w:hAnsi="Times" w:cs="Times"/>
+              </w:rPr>
+              <w:t>an</w:t>
+            </w:r>
+            <w:proofErr w:type="gramEnd"/>
+            <w:r>
+              <w:rPr>
+                <w:rFonts w:ascii="Times" w:eastAsiaTheme="minorEastAsia" w:hAnsi="Times" w:cs="Times"/>
+                <w:b/>
+                <w:bCs/>
+                <w:i/>
+                <w:iCs/>
+              </w:rPr>
+              <w:t xml:space="preserve"> </w:t>
+            </w:r>
             <w:proofErr w:type="spellStart"/>
             <w:r>
               <w:rPr>
                 <w:rFonts w:ascii="Times" w:eastAsiaTheme="minorEastAsia" w:hAnsi="Times" w:cs="Times"/>
-              </w:rPr>
-              <w:t>Gaoruan</w:t>
+                <w:b/>
+                <w:bCs/>
+                <w:i/>
+                <w:iCs/>
+              </w:rPr>
+              <w:t>sfz</w:t>
             </w:r>
             <w:proofErr w:type="spellEnd"/>
             <w:r>
               <w:rPr>
                 <w:rFonts w:ascii="Times" w:eastAsiaTheme="minorEastAsia" w:hAnsi="Times" w:cs="Times"/>
               </w:rPr>
-              <w:t xml:space="preserve"> GR</w:t>
-            </w:r>
-          </w:p>
-        </w:tc>
-        <w:tc>
-          <w:tcPr>
-            <w:tcW w:w="2977" w:type="dxa"/>
-          </w:tcPr>
-          <w:p>
-            <w:pPr>
-              <w:rPr>
-                <w:rFonts w:ascii="Times" w:eastAsiaTheme="minorEastAsia" w:hAnsi="Times" w:cs="Times"/>
-              </w:rPr>
-            </w:pPr>
-            <w:r>
-              <w:rPr>
-                <w:rFonts w:ascii="Times" w:eastAsiaTheme="minorEastAsia" w:hAnsi="Times" w:cs="Times"/>
-              </w:rPr>
-              <w:t>Additional notes (G &amp; D). Is this correct?</w:t>
+              <w:t>?</w:t>
             </w:r>
           </w:p>
         </w:tc>
@@ -1377,105 +1465,51 @@
             <w:pPr>
               <w:jc w:val="center"/>
               <w:rPr>
+                <w:rFonts w:ascii="Times" w:eastAsiaTheme="minorEastAsia" w:hAnsi="Times" w:cs="Times" w:hint="eastAsia"/>
+              </w:rPr>
+            </w:pPr>
+            <w:r>
+              <w:rPr>
                 <w:rFonts w:ascii="Times" w:eastAsiaTheme="minorEastAsia" w:hAnsi="Times" w:cs="Times"/>
               </w:rPr>
-            </w:pPr>
-            <w:r>
+              <w:t>73</w:t>
+            </w:r>
+          </w:p>
+        </w:tc>
+        <w:tc>
+          <w:tcPr>
+            <w:tcW w:w="1985" w:type="dxa"/>
+          </w:tcPr>
+          <w:p>
+            <w:pPr>
+              <w:jc w:val="center"/>
               <w:rPr>
                 <w:rFonts w:ascii="Times" w:eastAsiaTheme="minorEastAsia" w:hAnsi="Times" w:cs="Times" w:hint="eastAsia"/>
               </w:rPr>
-              <w:t>292</w:t>
-            </w:r>
-          </w:p>
-        </w:tc>
-        <w:tc>
-          <w:tcPr>
-            <w:tcW w:w="1985" w:type="dxa"/>
-          </w:tcPr>
-          <w:p>
-            <w:pPr>
-              <w:jc w:val="center"/>
+            </w:pPr>
+            <w:r>
               <w:rPr>
                 <w:rFonts w:ascii="Times" w:eastAsiaTheme="minorEastAsia" w:hAnsi="Times" w:cs="Times"/>
               </w:rPr>
-            </w:pPr>
-            <w:r>
+              <w:t>Cello</w:t>
+            </w:r>
+          </w:p>
+        </w:tc>
+        <w:tc>
+          <w:tcPr>
+            <w:tcW w:w="2977" w:type="dxa"/>
+          </w:tcPr>
+          <w:p>
+            <w:pPr>
               <w:rPr>
                 <w:rFonts w:ascii="Times" w:eastAsiaTheme="minorEastAsia" w:hAnsi="Times" w:cs="Times" w:hint="eastAsia"/>
               </w:rPr>
-              <w:t>Perc 3-6</w:t>
-            </w:r>
+            </w:pPr>
             <w:r>
               <w:rPr>
                 <w:rFonts w:ascii="Times" w:eastAsiaTheme="minorEastAsia" w:hAnsi="Times" w:cs="Times"/>
               </w:rPr>
-              <w:t xml:space="preserve"> </w:t>
-            </w:r>
-          </w:p>
-        </w:tc>
-        <w:tc>
-          <w:tcPr>
-            <w:tcW w:w="2977" w:type="dxa"/>
-          </w:tcPr>
-          <w:p>
-            <w:pPr>
-              <w:rPr>
-                <w:rFonts w:ascii="Times" w:eastAsiaTheme="minorEastAsia" w:hAnsi="Times" w:cs="Times"/>
-              </w:rPr>
-            </w:pPr>
-            <w:r>
-              <w:rPr>
-                <w:rFonts w:ascii="Times" w:eastAsiaTheme="minorEastAsia" w:hAnsi="Times" w:cs="Times" w:hint="eastAsia"/>
-              </w:rPr>
-              <w:t xml:space="preserve">Windchimes and </w:t>
-            </w:r>
-            <w:proofErr w:type="spellStart"/>
-            <w:r>
-              <w:rPr>
-                <w:rFonts w:ascii="Times" w:eastAsiaTheme="minorEastAsia" w:hAnsi="Times" w:cs="Times" w:hint="eastAsia"/>
-              </w:rPr>
-              <w:t>Glasschimes</w:t>
-            </w:r>
-            <w:proofErr w:type="spellEnd"/>
-            <w:r>
-              <w:rPr>
-                <w:rFonts w:ascii="Times" w:eastAsiaTheme="minorEastAsia" w:hAnsi="Times" w:cs="Times" w:hint="eastAsia"/>
-              </w:rPr>
-              <w:t xml:space="preserve"> are not listed in the instrument list.</w:t>
-            </w:r>
-          </w:p>
-          <w:p>
-            <w:pPr>
-              <w:rPr>
-                <w:rFonts w:ascii="Times" w:eastAsiaTheme="minorEastAsia" w:hAnsi="Times" w:cs="Times"/>
-              </w:rPr>
-            </w:pPr>
-          </w:p>
-          <w:p>
-            <w:pPr>
-              <w:rPr>
-                <w:rFonts w:ascii="Times" w:eastAsiaTheme="minorEastAsia" w:hAnsi="Times" w:cs="Times"/>
-              </w:rPr>
-            </w:pPr>
-            <w:r>
-              <w:rPr>
-                <w:rFonts w:ascii="Times" w:eastAsiaTheme="minorEastAsia" w:hAnsi="Times" w:cs="Times"/>
-              </w:rPr>
-              <w:t xml:space="preserve">Likewise, is </w:t>
-            </w:r>
-            <w:proofErr w:type="spellStart"/>
-            <w:r>
-              <w:rPr>
-                <w:rFonts w:ascii="Times" w:eastAsiaTheme="minorEastAsia" w:hAnsi="Times" w:cs="Times"/>
-              </w:rPr>
-              <w:t>glasschime</w:t>
-            </w:r>
-            <w:proofErr w:type="spellEnd"/>
-            <w:r>
-              <w:rPr>
-                <w:rFonts w:ascii="Times" w:eastAsiaTheme="minorEastAsia" w:hAnsi="Times" w:cs="Times"/>
-              </w:rPr>
-              <w:t xml:space="preserve"> and windchime the same instrument? </w:t>
+              <w:t>Added tenor clef instead of treble.</w:t>
             </w:r>
           </w:p>
         </w:tc>
@@ -1508,16 +1542,14 @@
             <w:pPr>
               <w:jc w:val="center"/>
               <w:rPr>
-                <w:rFonts w:ascii="Times" w:eastAsia="Times" w:hAnsi="Times" w:cs="Times"/>
-                <w:lang w:eastAsia="zh-TW"/>
-              </w:rPr>
-            </w:pPr>
-            <w:r>
-              <w:rPr>
-                <w:rFonts w:ascii="Times" w:eastAsia="Times" w:hAnsi="Times" w:cs="Times"/>
-                <w:lang w:eastAsia="zh-TW"/>
-              </w:rPr>
-              <w:t>188-234</w:t>
+                <w:rFonts w:ascii="Times" w:eastAsiaTheme="minorEastAsia" w:hAnsi="Times" w:cs="Times"/>
+              </w:rPr>
+            </w:pPr>
+            <w:r>
+              <w:rPr>
+                <w:rFonts w:ascii="Times" w:eastAsiaTheme="minorEastAsia" w:hAnsi="Times" w:cs="Times" w:hint="eastAsia"/>
+              </w:rPr>
+              <w:t>292</w:t>
             </w:r>
           </w:p>
         </w:tc>
@@ -1529,16 +1561,20 @@
             <w:pPr>
               <w:jc w:val="center"/>
               <w:rPr>
-                <w:rFonts w:ascii="Times" w:eastAsia="Times" w:hAnsi="Times" w:cs="Times"/>
-                <w:lang w:eastAsia="zh-TW"/>
-              </w:rPr>
-            </w:pPr>
-            <w:r>
-              <w:rPr>
-                <w:rFonts w:ascii="Times" w:eastAsia="Times" w:hAnsi="Times" w:cs="Times"/>
-                <w:lang w:eastAsia="zh-TW"/>
-              </w:rPr>
-              <w:t>Pipa Solo</w:t>
+                <w:rFonts w:ascii="Times" w:eastAsiaTheme="minorEastAsia" w:hAnsi="Times" w:cs="Times"/>
+              </w:rPr>
+            </w:pPr>
+            <w:r>
+              <w:rPr>
+                <w:rFonts w:ascii="Times" w:eastAsiaTheme="minorEastAsia" w:hAnsi="Times" w:cs="Times" w:hint="eastAsia"/>
+              </w:rPr>
+              <w:t>Perc 3-6</w:t>
+            </w:r>
+            <w:r>
+              <w:rPr>
+                <w:rFonts w:ascii="Times" w:eastAsiaTheme="minorEastAsia" w:hAnsi="Times" w:cs="Times"/>
+              </w:rPr>
+              <w:t xml:space="preserve"> </w:t>
             </w:r>
           </w:p>
         </w:tc>
@@ -1549,16 +1585,62 @@
           <w:p>
             <w:pPr>
               <w:rPr>
-                <w:rFonts w:ascii="Times" w:eastAsia="Times" w:hAnsi="Times" w:cs="Times"/>
-                <w:lang w:eastAsia="zh-TW"/>
-              </w:rPr>
-            </w:pPr>
-            <w:r>
-              <w:rPr>
-                <w:rFonts w:ascii="Times" w:eastAsia="Times" w:hAnsi="Times" w:cs="Times"/>
-                <w:lang w:eastAsia="zh-TW"/>
-              </w:rPr>
-              <w:t xml:space="preserve">Replaced excessive ledger lines with alternative scoring solutions to make it easier to read. </w:t>
+                <w:rFonts w:ascii="Times" w:eastAsiaTheme="minorEastAsia" w:hAnsi="Times" w:cs="Times"/>
+              </w:rPr>
+            </w:pPr>
+            <w:r>
+              <w:rPr>
+                <w:rFonts w:ascii="Times" w:eastAsiaTheme="minorEastAsia" w:hAnsi="Times" w:cs="Times" w:hint="eastAsia"/>
+              </w:rPr>
+              <w:t xml:space="preserve">Windchimes and </w:t>
+            </w:r>
+            <w:proofErr w:type="spellStart"/>
+            <w:r>
+              <w:rPr>
+                <w:rFonts w:ascii="Times" w:eastAsiaTheme="minorEastAsia" w:hAnsi="Times" w:cs="Times" w:hint="eastAsia"/>
+              </w:rPr>
+              <w:t>Glasschimes</w:t>
+            </w:r>
+            <w:proofErr w:type="spellEnd"/>
+            <w:r>
+              <w:rPr>
+                <w:rFonts w:ascii="Times" w:eastAsiaTheme="minorEastAsia" w:hAnsi="Times" w:cs="Times" w:hint="eastAsia"/>
+              </w:rPr>
+              <w:t xml:space="preserve"> are not listed in the instrument list.</w:t>
+            </w:r>
+          </w:p>
+          <w:p>
+            <w:pPr>
+              <w:rPr>
+                <w:rFonts w:ascii="Times" w:eastAsiaTheme="minorEastAsia" w:hAnsi="Times" w:cs="Times"/>
+              </w:rPr>
+            </w:pPr>
+          </w:p>
+          <w:p>
+            <w:pPr>
+              <w:rPr>
+                <w:rFonts w:ascii="Times" w:eastAsiaTheme="minorEastAsia" w:hAnsi="Times" w:cs="Times"/>
+              </w:rPr>
+            </w:pPr>
+            <w:r>
+              <w:rPr>
+                <w:rFonts w:ascii="Times" w:eastAsiaTheme="minorEastAsia" w:hAnsi="Times" w:cs="Times"/>
+              </w:rPr>
+              <w:t xml:space="preserve">Likewise, is </w:t>
+            </w:r>
+            <w:proofErr w:type="spellStart"/>
+            <w:r>
+              <w:rPr>
+                <w:rFonts w:ascii="Times" w:eastAsiaTheme="minorEastAsia" w:hAnsi="Times" w:cs="Times"/>
+              </w:rPr>
+              <w:t>glasschime</w:t>
+            </w:r>
+            <w:proofErr w:type="spellEnd"/>
+            <w:r>
+              <w:rPr>
+                <w:rFonts w:ascii="Times" w:eastAsiaTheme="minorEastAsia" w:hAnsi="Times" w:cs="Times"/>
+              </w:rPr>
+              <w:t xml:space="preserve"> and windchime the same instrument? </w:t>
             </w:r>
           </w:p>
         </w:tc>
@@ -1571,7 +1653,7 @@
             <w:pPr>
               <w:jc w:val="center"/>
               <w:rPr>
-                <w:rFonts w:ascii="Times New Roman" w:hAnsi="Times New Roman" w:cs="Times New Roman"/>
+                <w:rFonts w:ascii="Times" w:eastAsia="Times" w:hAnsi="Times" w:cs="Times"/>
                 <w:color w:val="FF0000"/>
                 <w:lang w:eastAsia="zh-TW"/>
               </w:rPr>
@@ -1595,6 +1677,13 @@
                 <w:lang w:eastAsia="zh-TW"/>
               </w:rPr>
             </w:pPr>
+            <w:r>
+              <w:rPr>
+                <w:rFonts w:ascii="Times" w:eastAsia="Times" w:hAnsi="Times" w:cs="Times"/>
+                <w:lang w:eastAsia="zh-TW"/>
+              </w:rPr>
+              <w:t>188-234</w:t>
+            </w:r>
           </w:p>
         </w:tc>
         <w:tc>
@@ -1606,9 +1695,16 @@
               <w:jc w:val="center"/>
               <w:rPr>
                 <w:rFonts w:ascii="Times" w:eastAsia="Times" w:hAnsi="Times" w:cs="Times"/>
-                <w:lang w:val="en-US" w:eastAsia="zh-TW"/>
-              </w:rPr>
-            </w:pPr>
+                <w:lang w:eastAsia="zh-TW"/>
+              </w:rPr>
+            </w:pPr>
+            <w:r>
+              <w:rPr>
+                <w:rFonts w:ascii="Times" w:eastAsia="Times" w:hAnsi="Times" w:cs="Times"/>
+                <w:lang w:eastAsia="zh-TW"/>
+              </w:rPr>
+              <w:t>Pipa Solo</w:t>
+            </w:r>
           </w:p>
         </w:tc>
         <w:tc>
@@ -1622,6 +1718,13 @@
                 <w:lang w:eastAsia="zh-TW"/>
               </w:rPr>
             </w:pPr>
+            <w:r>
+              <w:rPr>
+                <w:rFonts w:ascii="Times" w:eastAsia="Times" w:hAnsi="Times" w:cs="Times"/>
+                <w:lang w:eastAsia="zh-TW"/>
+              </w:rPr>
+              <w:t xml:space="preserve">Replaced excessive ledger lines with alternative scoring solutions to make it easier to read. </w:t>
+            </w:r>
           </w:p>
         </w:tc>
         <w:tc>
@@ -1657,6 +1760,13 @@
                 <w:lang w:eastAsia="zh-TW"/>
               </w:rPr>
             </w:pPr>
+            <w:r>
+              <w:rPr>
+                <w:rFonts w:ascii="Times" w:eastAsia="Times" w:hAnsi="Times" w:cs="Times"/>
+                <w:lang w:eastAsia="zh-TW"/>
+              </w:rPr>
+              <w:t>293</w:t>
+            </w:r>
           </w:p>
         </w:tc>
         <w:tc>
@@ -1668,9 +1778,16 @@
               <w:jc w:val="center"/>
               <w:rPr>
                 <w:rFonts w:ascii="Times" w:eastAsia="Times" w:hAnsi="Times" w:cs="Times"/>
-                <w:lang w:eastAsia="zh-TW"/>
-              </w:rPr>
-            </w:pPr>
+                <w:lang w:val="en-US" w:eastAsia="zh-TW"/>
+              </w:rPr>
+            </w:pPr>
+            <w:r>
+              <w:rPr>
+                <w:rFonts w:ascii="Times" w:eastAsia="Times" w:hAnsi="Times" w:cs="Times"/>
+                <w:lang w:val="en-US" w:eastAsia="zh-TW"/>
+              </w:rPr>
+              <w:t>Contrabass</w:t>
+            </w:r>
           </w:p>
         </w:tc>
         <w:tc>
@@ -1684,6 +1801,144 @@
                 <w:lang w:eastAsia="zh-TW"/>
               </w:rPr>
             </w:pPr>
+            <w:r>
+              <w:rPr>
+                <w:rFonts w:ascii="Times" w:eastAsia="Times" w:hAnsi="Times" w:cs="Times"/>
+                <w:lang w:eastAsia="zh-TW"/>
+              </w:rPr>
+              <w:t>Edited sul D 8</w:t>
+            </w:r>
+            <w:r>
+              <w:rPr>
+                <w:rFonts w:ascii="Times" w:eastAsia="Times" w:hAnsi="Times" w:cs="Times"/>
+                <w:vertAlign w:val="superscript"/>
+                <w:lang w:eastAsia="zh-TW"/>
+              </w:rPr>
+              <w:t>th</w:t>
+            </w:r>
+            <w:r>
+              <w:rPr>
+                <w:rFonts w:ascii="Times" w:eastAsia="Times" w:hAnsi="Times" w:cs="Times"/>
+                <w:lang w:eastAsia="zh-TW"/>
+              </w:rPr>
+              <w:t xml:space="preserve"> partial to 6</w:t>
+            </w:r>
+            <w:r>
+              <w:rPr>
+                <w:rFonts w:ascii="Times" w:eastAsia="Times" w:hAnsi="Times" w:cs="Times"/>
+                <w:vertAlign w:val="superscript"/>
+                <w:lang w:eastAsia="zh-TW"/>
+              </w:rPr>
+              <w:t>th</w:t>
+            </w:r>
+            <w:r>
+              <w:rPr>
+                <w:rFonts w:ascii="Times" w:eastAsia="Times" w:hAnsi="Times" w:cs="Times"/>
+                <w:lang w:eastAsia="zh-TW"/>
+              </w:rPr>
+              <w:t xml:space="preserve"> partial on sul G</w:t>
+            </w:r>
+          </w:p>
+        </w:tc>
+        <w:tc>
+          <w:tcPr>
+            <w:tcW w:w="2994" w:type="dxa"/>
+            <w:vAlign w:val="center"/>
+          </w:tcPr>
+          <w:p>
+            <w:pPr>
+              <w:jc w:val="center"/>
+              <w:rPr>
+                <w:rFonts w:ascii="Times New Roman" w:hAnsi="Times New Roman" w:cs="Times New Roman"/>
+                <w:color w:val="FF0000"/>
+                <w:lang w:eastAsia="zh-TW"/>
+              </w:rPr>
+            </w:pPr>
+          </w:p>
+        </w:tc>
+      </w:tr>
+      <w:tr>
+        <w:trPr>
+          <w:trHeight w:val="552"/>
+        </w:trPr>
+        <w:tc>
+          <w:tcPr>
+            <w:tcW w:w="1129" w:type="dxa"/>
+          </w:tcPr>
+          <w:p>
+            <w:pPr>
+              <w:jc w:val="center"/>
+              <w:rPr>
+                <w:rFonts w:ascii="Times" w:eastAsia="Times" w:hAnsi="Times" w:cs="Times"/>
+                <w:lang w:eastAsia="zh-TW"/>
+              </w:rPr>
+            </w:pPr>
+            <w:r>
+              <w:rPr>
+                <w:rFonts w:ascii="Times" w:eastAsia="Times" w:hAnsi="Times" w:cs="Times"/>
+                <w:lang w:eastAsia="zh-TW"/>
+              </w:rPr>
+              <w:t>293</w:t>
+            </w:r>
+          </w:p>
+        </w:tc>
+        <w:tc>
+          <w:tcPr>
+            <w:tcW w:w="1985" w:type="dxa"/>
+          </w:tcPr>
+          <w:p>
+            <w:pPr>
+              <w:jc w:val="center"/>
+              <w:rPr>
+                <w:rFonts w:ascii="Times" w:eastAsia="Times" w:hAnsi="Times" w:cs="Times"/>
+                <w:lang w:eastAsia="zh-TW"/>
+              </w:rPr>
+            </w:pPr>
+            <w:proofErr w:type="spellStart"/>
+            <w:r>
+              <w:rPr>
+                <w:rFonts w:ascii="Times" w:eastAsia="Times" w:hAnsi="Times" w:cs="Times"/>
+                <w:lang w:eastAsia="zh-TW"/>
+              </w:rPr>
+              <w:t>Vc</w:t>
+            </w:r>
+            <w:proofErr w:type="spellEnd"/>
+            <w:r>
+              <w:rPr>
+                <w:rFonts w:ascii="Times" w:eastAsia="Times" w:hAnsi="Times" w:cs="Times"/>
+                <w:lang w:eastAsia="zh-TW"/>
+              </w:rPr>
+              <w:t xml:space="preserve">, </w:t>
+            </w:r>
+            <w:proofErr w:type="spellStart"/>
+            <w:r>
+              <w:rPr>
+                <w:rFonts w:ascii="Times" w:eastAsia="Times" w:hAnsi="Times" w:cs="Times"/>
+                <w:lang w:eastAsia="zh-TW"/>
+              </w:rPr>
+              <w:t>Cb</w:t>
+            </w:r>
+            <w:proofErr w:type="spellEnd"/>
+          </w:p>
+        </w:tc>
+        <w:tc>
+          <w:tcPr>
+            <w:tcW w:w="2977" w:type="dxa"/>
+          </w:tcPr>
+          <w:p>
+            <w:pPr>
+              <w:rPr>
+                <w:rFonts w:ascii="Times" w:eastAsia="Times" w:hAnsi="Times" w:cs="Times"/>
+                <w:lang w:eastAsia="zh-TW"/>
+              </w:rPr>
+            </w:pPr>
+            <w:r>
+              <w:rPr>
+                <w:rFonts w:ascii="Times" w:eastAsia="Times" w:hAnsi="Times" w:cs="Times"/>
+                <w:lang w:eastAsia="zh-TW"/>
+              </w:rPr>
+              <w:t>Removed excessive ledger lines.</w:t>
+            </w:r>
           </w:p>
         </w:tc>
         <w:tc>

</xml_diff>

<commit_message>
Corrected pages 17 and 38 for collision, plus other minor fixes. Replaced tutti/div/unis inconsistencies. Still go some left to do.
</commit_message>
<xml_diff>
--- a/Working Folder/7 Gordon Fung 冯迪伦 - Arise, You Lion of Glory! 狮舞弄清韻/7 Gordon Fung 冯迪伦 - Arise, You Lion of Glory! 狮舞弄清韻 - Errata_v1.docx
+++ b/Working Folder/7 Gordon Fung 冯迪伦 - Arise, You Lion of Glory! 狮舞弄清韻/7 Gordon Fung 冯迪伦 - Arise, You Lion of Glory! 狮舞弄清韻 - Errata_v1.docx
@@ -271,7 +271,7 @@
         </w:numPr>
         <w:jc w:val="both"/>
         <w:rPr>
-          <w:rFonts w:ascii="Times" w:eastAsia="Times" w:hAnsi="Times" w:cs="Times"/>
+          <w:rFonts w:ascii="Times New Roman" w:eastAsia="Times" w:hAnsi="Times New Roman" w:cs="Times New Roman"/>
           <w:bCs/>
           <w:sz w:val="32"/>
           <w:szCs w:val="32"/>
@@ -279,36 +279,16 @@
       </w:pPr>
       <w:r>
         <w:rPr>
-          <w:rFonts w:ascii="Times" w:eastAsia="Times" w:hAnsi="Times" w:cs="Times"/>
-          <w:bCs/>
-          <w:sz w:val="32"/>
-          <w:szCs w:val="32"/>
-        </w:rPr>
-        <w:t xml:space="preserve">Font and format changes, including use of </w:t>
-      </w:r>
-      <w:proofErr w:type="gramStart"/>
-      <w:r>
-        <w:rPr>
-          <w:rFonts w:ascii="Times" w:eastAsia="Times" w:hAnsi="Times" w:cs="Times"/>
-          <w:bCs/>
-          <w:sz w:val="32"/>
-          <w:szCs w:val="32"/>
-        </w:rPr>
-        <w:t>small time</w:t>
-      </w:r>
-      <w:proofErr w:type="gramEnd"/>
-      <w:r>
-        <w:rPr>
-          <w:rFonts w:ascii="Times" w:eastAsia="Times" w:hAnsi="Times" w:cs="Times"/>
-          <w:bCs/>
-          <w:sz w:val="32"/>
-          <w:szCs w:val="32"/>
-        </w:rPr>
-        <w:t xml:space="preserve"> signatures, as agreed by SCO. </w:t>
+          <w:rFonts w:ascii="Times New Roman" w:eastAsia="Times" w:hAnsi="Times New Roman" w:cs="Times New Roman"/>
+          <w:bCs/>
+          <w:sz w:val="32"/>
+          <w:szCs w:val="32"/>
+        </w:rPr>
+        <w:t xml:space="preserve">Font and format changes, including use of small time signatures, as agreed by SCO. </w:t>
       </w:r>
       <w:r>
         <w:rPr>
-          <w:rFonts w:ascii="SimSun" w:hAnsi="SimSun" w:cs="SimSun" w:hint="eastAsia"/>
+          <w:rFonts w:ascii="Times New Roman" w:hAnsi="Times New Roman" w:cs="Times New Roman"/>
           <w:bCs/>
           <w:sz w:val="32"/>
           <w:szCs w:val="32"/>
@@ -317,7 +297,7 @@
       </w:r>
       <w:r>
         <w:rPr>
-          <w:rFonts w:ascii="Times" w:eastAsia="Times" w:hAnsi="Times" w:cs="Times" w:hint="eastAsia"/>
+          <w:rFonts w:ascii="Times New Roman" w:eastAsia="Times" w:hAnsi="Times New Roman" w:cs="Times New Roman"/>
           <w:bCs/>
           <w:sz w:val="32"/>
           <w:szCs w:val="32"/>
@@ -326,21 +306,12 @@
       </w:r>
       <w:r>
         <w:rPr>
-          <w:rFonts w:ascii="SimSun" w:hAnsi="SimSun" w:cs="SimSun" w:hint="eastAsia"/>
-          <w:bCs/>
-          <w:sz w:val="32"/>
-          <w:szCs w:val="32"/>
-        </w:rPr>
-        <w:t>同意</w:t>
-      </w:r>
-      <w:r>
-        <w:rPr>
-          <w:rFonts w:ascii="SimSun" w:hAnsi="SimSun" w:cs="SimSun" w:hint="eastAsia"/>
-          <w:bCs/>
-          <w:sz w:val="32"/>
-          <w:szCs w:val="32"/>
-        </w:rPr>
-        <w:t>。</w:t>
+          <w:rFonts w:ascii="Times New Roman" w:hAnsi="Times New Roman" w:cs="Times New Roman"/>
+          <w:bCs/>
+          <w:sz w:val="32"/>
+          <w:szCs w:val="32"/>
+        </w:rPr>
+        <w:t>同意。</w:t>
       </w:r>
     </w:p>
     <w:p>
@@ -352,7 +323,7 @@
         </w:numPr>
         <w:jc w:val="both"/>
         <w:rPr>
-          <w:rFonts w:ascii="Times" w:eastAsia="Times" w:hAnsi="Times" w:cs="Times"/>
+          <w:rFonts w:ascii="Times New Roman" w:eastAsia="Times" w:hAnsi="Times New Roman" w:cs="Times New Roman"/>
           <w:bCs/>
           <w:sz w:val="32"/>
           <w:szCs w:val="32"/>
@@ -360,7 +331,7 @@
       </w:pPr>
       <w:r>
         <w:rPr>
-          <w:rFonts w:ascii="Times" w:eastAsia="Times" w:hAnsi="Times" w:cs="Times"/>
+          <w:rFonts w:ascii="Times New Roman" w:eastAsia="Times" w:hAnsi="Times New Roman" w:cs="Times New Roman"/>
           <w:bCs/>
           <w:sz w:val="32"/>
           <w:szCs w:val="32"/>
@@ -369,7 +340,7 @@
       </w:r>
       <w:r>
         <w:rPr>
-          <w:rFonts w:ascii="SimSun" w:hAnsi="SimSun" w:cs="SimSun" w:hint="eastAsia"/>
+          <w:rFonts w:ascii="Times New Roman" w:hAnsi="Times New Roman" w:cs="Times New Roman"/>
           <w:bCs/>
           <w:sz w:val="32"/>
           <w:szCs w:val="32"/>
@@ -378,7 +349,7 @@
       </w:r>
       <w:r>
         <w:rPr>
-          <w:rFonts w:ascii="Times" w:eastAsia="Times" w:hAnsi="Times" w:cs="Times" w:hint="eastAsia"/>
+          <w:rFonts w:ascii="Times New Roman" w:eastAsia="Times" w:hAnsi="Times New Roman" w:cs="Times New Roman"/>
           <w:bCs/>
           <w:sz w:val="32"/>
           <w:szCs w:val="32"/>
@@ -387,21 +358,12 @@
       </w:r>
       <w:r>
         <w:rPr>
-          <w:rFonts w:ascii="SimSun" w:hAnsi="SimSun" w:cs="SimSun" w:hint="eastAsia"/>
-          <w:bCs/>
-          <w:sz w:val="32"/>
-          <w:szCs w:val="32"/>
-        </w:rPr>
-        <w:t>文字</w:t>
-      </w:r>
-      <w:r>
-        <w:rPr>
-          <w:rFonts w:ascii="SimSun" w:hAnsi="SimSun" w:cs="SimSun" w:hint="eastAsia"/>
-          <w:bCs/>
-          <w:sz w:val="32"/>
-          <w:szCs w:val="32"/>
-        </w:rPr>
-        <w:t>。</w:t>
+          <w:rFonts w:ascii="Times New Roman" w:hAnsi="Times New Roman" w:cs="Times New Roman"/>
+          <w:bCs/>
+          <w:sz w:val="32"/>
+          <w:szCs w:val="32"/>
+        </w:rPr>
+        <w:t>文字。</w:t>
       </w:r>
     </w:p>
     <w:p>
@@ -413,7 +375,7 @@
         </w:numPr>
         <w:jc w:val="both"/>
         <w:rPr>
-          <w:rFonts w:ascii="Times" w:eastAsia="Times" w:hAnsi="Times" w:cs="Times"/>
+          <w:rFonts w:ascii="Times New Roman" w:eastAsia="Times" w:hAnsi="Times New Roman" w:cs="Times New Roman"/>
           <w:bCs/>
           <w:sz w:val="32"/>
           <w:szCs w:val="32"/>
@@ -421,7 +383,7 @@
       </w:pPr>
       <w:r>
         <w:rPr>
-          <w:rFonts w:ascii="Times" w:eastAsia="Times" w:hAnsi="Times" w:cs="Times"/>
+          <w:rFonts w:ascii="Times New Roman" w:eastAsia="Times" w:hAnsi="Times New Roman" w:cs="Times New Roman"/>
           <w:bCs/>
           <w:sz w:val="32"/>
           <w:szCs w:val="32"/>
@@ -430,7 +392,7 @@
       </w:r>
       <w:r>
         <w:rPr>
-          <w:rFonts w:ascii="SimSun" w:hAnsi="SimSun" w:cs="SimSun" w:hint="eastAsia"/>
+          <w:rFonts w:ascii="Times New Roman" w:hAnsi="Times New Roman" w:cs="Times New Roman"/>
           <w:bCs/>
           <w:sz w:val="32"/>
           <w:szCs w:val="32"/>
@@ -440,6 +402,31 @@
     </w:p>
     <w:p>
       <w:pPr>
+        <w:pStyle w:val="ListParagraph"/>
+        <w:numPr>
+          <w:ilvl w:val="0"/>
+          <w:numId w:val="6"/>
+        </w:numPr>
+        <w:jc w:val="both"/>
+        <w:rPr>
+          <w:rFonts w:ascii="Times New Roman" w:eastAsia="Times" w:hAnsi="Times New Roman" w:cs="Times New Roman"/>
+          <w:bCs/>
+          <w:sz w:val="32"/>
+          <w:szCs w:val="32"/>
+        </w:rPr>
+      </w:pPr>
+      <w:r>
+        <w:rPr>
+          <w:rFonts w:ascii="Times New Roman" w:hAnsi="Times New Roman" w:cs="Times New Roman"/>
+          <w:bCs/>
+          <w:sz w:val="32"/>
+          <w:szCs w:val="32"/>
+        </w:rPr>
+        <w:t>Replaced divisi, tutti and unis. conventions to match with SCO guidelines.</w:t>
+      </w:r>
+    </w:p>
+    <w:p>
+      <w:pPr>
         <w:ind w:left="720"/>
         <w:jc w:val="both"/>
         <w:rPr>
@@ -451,7 +438,7 @@
       </w:pPr>
       <w:r>
         <w:rPr>
-          <w:rFonts w:ascii="Times" w:eastAsia="Times" w:hAnsi="Times" w:cs="Times"/>
+          <w:rFonts w:ascii="Times New Roman" w:eastAsia="Times" w:hAnsi="Times New Roman" w:cs="Times New Roman"/>
           <w:bCs/>
           <w:sz w:val="32"/>
           <w:szCs w:val="32"/>
@@ -460,12 +447,21 @@
       </w:r>
       <w:r>
         <w:rPr>
+          <w:rFonts w:ascii="Times New Roman" w:hAnsi="Times New Roman" w:cs="Times New Roman"/>
+          <w:bCs/>
+          <w:sz w:val="32"/>
+          <w:szCs w:val="32"/>
+        </w:rPr>
+        <w:t>对于此类编辑，我已将其中一些标记为粉红色</w:t>
+      </w:r>
+      <w:r>
+        <w:rPr>
           <w:rFonts w:ascii="SimSun" w:hAnsi="SimSun" w:cs="SimSun" w:hint="eastAsia"/>
           <w:bCs/>
           <w:sz w:val="32"/>
           <w:szCs w:val="32"/>
         </w:rPr>
-        <w:t>对于此类编辑，我已将其中一些标记为粉红色，但未在下面的勘误表列表中对其进行描述。</w:t>
+        <w:t>，但未在下面的勘误表列表中对其进行描述。</w:t>
       </w:r>
     </w:p>
     <w:p>
@@ -862,17 +858,8 @@
                 <w:rFonts w:ascii="Times New Roman" w:hAnsi="Times New Roman" w:cs="Times New Roman"/>
                 <w:lang w:eastAsia="zh-TW"/>
               </w:rPr>
-              <w:t>雜聲吊</w:t>
-            </w:r>
-            <w:proofErr w:type="gramStart"/>
-            <w:r>
-              <w:rPr>
-                <w:rFonts w:ascii="Times New Roman" w:hAnsi="Times New Roman" w:cs="Times New Roman"/>
-                <w:lang w:eastAsia="zh-TW"/>
-              </w:rPr>
-              <w:t>鈸</w:t>
-            </w:r>
-            <w:proofErr w:type="gramEnd"/>
+              <w:t>雜聲吊鈸</w:t>
+            </w:r>
             <w:r>
               <w:rPr>
                 <w:rFonts w:ascii="Times New Roman" w:hAnsi="Times New Roman" w:cs="Times New Roman" w:hint="eastAsia"/>
@@ -899,17 +886,8 @@
                 <w:rFonts w:ascii="Times New Roman" w:hAnsi="Times New Roman" w:cs="Times New Roman"/>
                 <w:lang w:eastAsia="zh-TW"/>
               </w:rPr>
-              <w:t>雜聲吊</w:t>
-            </w:r>
-            <w:proofErr w:type="gramStart"/>
-            <w:r>
-              <w:rPr>
-                <w:rFonts w:ascii="Times New Roman" w:hAnsi="Times New Roman" w:cs="Times New Roman"/>
-                <w:lang w:eastAsia="zh-TW"/>
-              </w:rPr>
-              <w:t>鈸</w:t>
-            </w:r>
-            <w:proofErr w:type="gramEnd"/>
+              <w:t>雜聲吊鈸</w:t>
+            </w:r>
             <w:r>
               <w:rPr>
                 <w:rFonts w:ascii="Times New Roman" w:hAnsi="Times New Roman" w:cs="Times New Roman"/>
@@ -1028,14 +1006,7 @@
               <w:rPr>
                 <w:rFonts w:ascii="Times" w:eastAsia="Times" w:hAnsi="Times" w:cs="Times"/>
               </w:rPr>
-              <w:t xml:space="preserve">ibraslap </w:t>
-            </w:r>
-            <w:proofErr w:type="gramStart"/>
-            <w:r>
-              <w:rPr>
-                <w:rFonts w:ascii="Times" w:eastAsia="Times" w:hAnsi="Times" w:cs="Times"/>
-              </w:rPr>
-              <w:t>is</w:t>
+              <w:t>ibraslap is</w:t>
             </w:r>
             <w:r>
               <w:rPr>
@@ -1047,14 +1018,14 @@
               <w:rPr>
                 <w:rFonts w:ascii="Times" w:eastAsia="Times" w:hAnsi="Times" w:cs="Times"/>
               </w:rPr>
-              <w:t>, but</w:t>
-            </w:r>
-            <w:proofErr w:type="gramEnd"/>
-            <w:r>
-              <w:rPr>
-                <w:rFonts w:ascii="Times" w:eastAsia="Times" w:hAnsi="Times" w:cs="Times"/>
-              </w:rPr>
-              <w:t xml:space="preserve"> score names them</w:t>
+              <w:t xml:space="preserve">, but score names </w:t>
+            </w:r>
+            <w:r>
+              <w:rPr>
+                <w:rFonts w:ascii="Times" w:eastAsia="Times" w:hAnsi="Times" w:cs="Times"/>
+              </w:rPr>
+              <w:lastRenderedPageBreak/>
+              <w:t>them</w:t>
             </w:r>
             <w:r>
               <w:rPr>
@@ -1094,7 +1065,6 @@
                 <w:rFonts w:ascii="Times" w:eastAsia="Times" w:hAnsi="Times" w:cs="Times"/>
                 <w:lang w:eastAsia="zh-TW"/>
               </w:rPr>
-              <w:lastRenderedPageBreak/>
               <w:t xml:space="preserve">SCO </w:t>
             </w:r>
             <w:r>
@@ -1295,23 +1265,7 @@
                 <w:rFonts w:ascii="Times" w:eastAsia="Times" w:hAnsi="Times" w:cs="Times"/>
                 <w:lang w:eastAsia="zh-TW"/>
               </w:rPr>
-              <w:t xml:space="preserve">Tempo 60 = </w:t>
-            </w:r>
-            <w:proofErr w:type="spellStart"/>
-            <w:r>
-              <w:rPr>
-                <w:rFonts w:ascii="Times" w:eastAsia="Times" w:hAnsi="Times" w:cs="Times"/>
-                <w:lang w:eastAsia="zh-TW"/>
-              </w:rPr>
-              <w:t>tuplet</w:t>
-            </w:r>
-            <w:proofErr w:type="spellEnd"/>
-            <w:r>
-              <w:rPr>
-                <w:rFonts w:ascii="Times" w:eastAsia="Times" w:hAnsi="Times" w:cs="Times"/>
-                <w:lang w:eastAsia="zh-TW"/>
-              </w:rPr>
-              <w:t>?</w:t>
+              <w:t>Tempo 60 = tuplet?</w:t>
             </w:r>
           </w:p>
         </w:tc>
@@ -1398,14 +1352,12 @@
               </w:rPr>
               <w:t xml:space="preserve"> </w:t>
             </w:r>
-            <w:proofErr w:type="gramStart"/>
             <w:r>
               <w:rPr>
                 <w:rFonts w:ascii="Times" w:eastAsiaTheme="minorEastAsia" w:hAnsi="Times" w:cs="Times"/>
               </w:rPr>
               <w:t>an</w:t>
             </w:r>
-            <w:proofErr w:type="gramEnd"/>
             <w:r>
               <w:rPr>
                 <w:rFonts w:ascii="Times" w:eastAsiaTheme="minorEastAsia" w:hAnsi="Times" w:cs="Times"/>
@@ -1416,7 +1368,6 @@
               </w:rPr>
               <w:t xml:space="preserve"> </w:t>
             </w:r>
-            <w:proofErr w:type="spellStart"/>
             <w:r>
               <w:rPr>
                 <w:rFonts w:ascii="Times" w:eastAsiaTheme="minorEastAsia" w:hAnsi="Times" w:cs="Times"/>
@@ -1427,7 +1378,6 @@
               </w:rPr>
               <w:t>sfz</w:t>
             </w:r>
-            <w:proofErr w:type="spellEnd"/>
             <w:r>
               <w:rPr>
                 <w:rFonts w:ascii="Times" w:eastAsiaTheme="minorEastAsia" w:hAnsi="Times" w:cs="Times"/>
@@ -1465,13 +1415,13 @@
             <w:pPr>
               <w:jc w:val="center"/>
               <w:rPr>
-                <w:rFonts w:ascii="Times" w:eastAsiaTheme="minorEastAsia" w:hAnsi="Times" w:cs="Times" w:hint="eastAsia"/>
-              </w:rPr>
-            </w:pPr>
-            <w:r>
-              <w:rPr>
                 <w:rFonts w:ascii="Times" w:eastAsiaTheme="minorEastAsia" w:hAnsi="Times" w:cs="Times"/>
               </w:rPr>
+            </w:pPr>
+            <w:r>
+              <w:rPr>
+                <w:rFonts w:ascii="Times" w:eastAsiaTheme="minorEastAsia" w:hAnsi="Times" w:cs="Times"/>
+              </w:rPr>
               <w:t>73</w:t>
             </w:r>
           </w:p>
@@ -1484,13 +1434,13 @@
             <w:pPr>
               <w:jc w:val="center"/>
               <w:rPr>
-                <w:rFonts w:ascii="Times" w:eastAsiaTheme="minorEastAsia" w:hAnsi="Times" w:cs="Times" w:hint="eastAsia"/>
-              </w:rPr>
-            </w:pPr>
-            <w:r>
-              <w:rPr>
                 <w:rFonts w:ascii="Times" w:eastAsiaTheme="minorEastAsia" w:hAnsi="Times" w:cs="Times"/>
               </w:rPr>
+            </w:pPr>
+            <w:r>
+              <w:rPr>
+                <w:rFonts w:ascii="Times" w:eastAsiaTheme="minorEastAsia" w:hAnsi="Times" w:cs="Times"/>
+              </w:rPr>
               <w:t>Cello</w:t>
             </w:r>
           </w:p>
@@ -1502,7 +1452,7 @@
           <w:p>
             <w:pPr>
               <w:rPr>
-                <w:rFonts w:ascii="Times" w:eastAsiaTheme="minorEastAsia" w:hAnsi="Times" w:cs="Times" w:hint="eastAsia"/>
+                <w:rFonts w:ascii="Times" w:eastAsiaTheme="minorEastAsia" w:hAnsi="Times" w:cs="Times"/>
               </w:rPr>
             </w:pPr>
             <w:r>
@@ -1592,21 +1542,7 @@
               <w:rPr>
                 <w:rFonts w:ascii="Times" w:eastAsiaTheme="minorEastAsia" w:hAnsi="Times" w:cs="Times" w:hint="eastAsia"/>
               </w:rPr>
-              <w:t xml:space="preserve">Windchimes and </w:t>
-            </w:r>
-            <w:proofErr w:type="spellStart"/>
-            <w:r>
-              <w:rPr>
-                <w:rFonts w:ascii="Times" w:eastAsiaTheme="minorEastAsia" w:hAnsi="Times" w:cs="Times" w:hint="eastAsia"/>
-              </w:rPr>
-              <w:t>Glasschimes</w:t>
-            </w:r>
-            <w:proofErr w:type="spellEnd"/>
-            <w:r>
-              <w:rPr>
-                <w:rFonts w:ascii="Times" w:eastAsiaTheme="minorEastAsia" w:hAnsi="Times" w:cs="Times" w:hint="eastAsia"/>
-              </w:rPr>
-              <w:t xml:space="preserve"> are not listed in the instrument list.</w:t>
+              <w:t>Windchimes and Glasschimes are not listed in the instrument list.</w:t>
             </w:r>
           </w:p>
           <w:p>
@@ -1626,21 +1562,7 @@
               <w:rPr>
                 <w:rFonts w:ascii="Times" w:eastAsiaTheme="minorEastAsia" w:hAnsi="Times" w:cs="Times"/>
               </w:rPr>
-              <w:t xml:space="preserve">Likewise, is </w:t>
-            </w:r>
-            <w:proofErr w:type="spellStart"/>
-            <w:r>
-              <w:rPr>
-                <w:rFonts w:ascii="Times" w:eastAsiaTheme="minorEastAsia" w:hAnsi="Times" w:cs="Times"/>
-              </w:rPr>
-              <w:t>glasschime</w:t>
-            </w:r>
-            <w:proofErr w:type="spellEnd"/>
-            <w:r>
-              <w:rPr>
-                <w:rFonts w:ascii="Times" w:eastAsiaTheme="minorEastAsia" w:hAnsi="Times" w:cs="Times"/>
-              </w:rPr>
-              <w:t xml:space="preserve"> and windchime the same instrument? </w:t>
+              <w:t xml:space="preserve">Likewise, is glasschime and windchime the same instrument? </w:t>
             </w:r>
           </w:p>
         </w:tc>
@@ -1894,31 +1816,13 @@
                 <w:lang w:eastAsia="zh-TW"/>
               </w:rPr>
             </w:pPr>
-            <w:proofErr w:type="spellStart"/>
-            <w:r>
-              <w:rPr>
-                <w:rFonts w:ascii="Times" w:eastAsia="Times" w:hAnsi="Times" w:cs="Times"/>
-                <w:lang w:eastAsia="zh-TW"/>
-              </w:rPr>
-              <w:t>Vc</w:t>
-            </w:r>
-            <w:proofErr w:type="spellEnd"/>
-            <w:r>
-              <w:rPr>
-                <w:rFonts w:ascii="Times" w:eastAsia="Times" w:hAnsi="Times" w:cs="Times"/>
-                <w:lang w:eastAsia="zh-TW"/>
-              </w:rPr>
-              <w:t xml:space="preserve">, </w:t>
-            </w:r>
-            <w:proofErr w:type="spellStart"/>
-            <w:r>
-              <w:rPr>
-                <w:rFonts w:ascii="Times" w:eastAsia="Times" w:hAnsi="Times" w:cs="Times"/>
-                <w:lang w:eastAsia="zh-TW"/>
-              </w:rPr>
-              <w:t>Cb</w:t>
-            </w:r>
-            <w:proofErr w:type="spellEnd"/>
+            <w:r>
+              <w:rPr>
+                <w:rFonts w:ascii="Times" w:eastAsia="Times" w:hAnsi="Times" w:cs="Times"/>
+                <w:lang w:eastAsia="zh-TW"/>
+              </w:rPr>
+              <w:t>Vc, Cb</w:t>
+            </w:r>
           </w:p>
         </w:tc>
         <w:tc>

</xml_diff>

<commit_message>
Pg 15-31 thoroughly reviewed and edited. Piece 7
</commit_message>
<xml_diff>
--- a/Working Folder/7 Gordon Fung 冯迪伦 - Arise, You Lion of Glory! 狮舞弄清韻/7 Gordon Fung 冯迪伦 - Arise, You Lion of Glory! 狮舞弄清韻 - Errata_v1.docx
+++ b/Working Folder/7 Gordon Fung 冯迪伦 - Arise, You Lion of Glory! 狮舞弄清韻/7 Gordon Fung 冯迪伦 - Arise, You Lion of Glory! 狮舞弄清韻 - Errata_v1.docx
@@ -1265,7 +1265,23 @@
                 <w:rFonts w:ascii="Times" w:eastAsia="Times" w:hAnsi="Times" w:cs="Times"/>
                 <w:lang w:eastAsia="zh-TW"/>
               </w:rPr>
-              <w:t>Tempo 60 = tuplet?</w:t>
+              <w:t xml:space="preserve">Tempo 60 = </w:t>
+            </w:r>
+            <w:proofErr w:type="spellStart"/>
+            <w:r>
+              <w:rPr>
+                <w:rFonts w:ascii="Times" w:eastAsia="Times" w:hAnsi="Times" w:cs="Times"/>
+                <w:lang w:eastAsia="zh-TW"/>
+              </w:rPr>
+              <w:t>tuplet</w:t>
+            </w:r>
+            <w:proofErr w:type="spellEnd"/>
+            <w:r>
+              <w:rPr>
+                <w:rFonts w:ascii="Times" w:eastAsia="Times" w:hAnsi="Times" w:cs="Times"/>
+                <w:lang w:eastAsia="zh-TW"/>
+              </w:rPr>
+              <w:t>?</w:t>
             </w:r>
           </w:p>
         </w:tc>
@@ -1368,6 +1384,7 @@
               </w:rPr>
               <w:t xml:space="preserve"> </w:t>
             </w:r>
+            <w:proofErr w:type="spellStart"/>
             <w:r>
               <w:rPr>
                 <w:rFonts w:ascii="Times" w:eastAsiaTheme="minorEastAsia" w:hAnsi="Times" w:cs="Times"/>
@@ -1378,6 +1395,7 @@
               </w:rPr>
               <w:t>sfz</w:t>
             </w:r>
+            <w:proofErr w:type="spellEnd"/>
             <w:r>
               <w:rPr>
                 <w:rFonts w:ascii="Times" w:eastAsiaTheme="minorEastAsia" w:hAnsi="Times" w:cs="Times"/>
@@ -1492,7 +1510,7 @@
             <w:pPr>
               <w:jc w:val="center"/>
               <w:rPr>
-                <w:rFonts w:ascii="Times" w:eastAsiaTheme="minorEastAsia" w:hAnsi="Times" w:cs="Times" w:hint="eastAsia"/>
+                <w:rFonts w:ascii="Times" w:eastAsiaTheme="minorEastAsia" w:hAnsi="Times" w:cs="Times"/>
               </w:rPr>
             </w:pPr>
             <w:r>
@@ -1511,7 +1529,7 @@
             <w:pPr>
               <w:jc w:val="center"/>
               <w:rPr>
-                <w:rFonts w:ascii="Times" w:eastAsiaTheme="minorEastAsia" w:hAnsi="Times" w:cs="Times" w:hint="eastAsia"/>
+                <w:rFonts w:ascii="Times" w:eastAsiaTheme="minorEastAsia" w:hAnsi="Times" w:cs="Times"/>
               </w:rPr>
             </w:pPr>
             <w:r>
@@ -1529,7 +1547,7 @@
           <w:p>
             <w:pPr>
               <w:rPr>
-                <w:rFonts w:ascii="Times" w:eastAsiaTheme="minorEastAsia" w:hAnsi="Times" w:cs="Times" w:hint="eastAsia"/>
+                <w:rFonts w:ascii="Times" w:eastAsiaTheme="minorEastAsia" w:hAnsi="Times" w:cs="Times"/>
               </w:rPr>
             </w:pPr>
             <w:r>
@@ -1585,14 +1603,14 @@
             <w:pPr>
               <w:jc w:val="center"/>
               <w:rPr>
-                <w:rFonts w:ascii="Times" w:eastAsiaTheme="minorEastAsia" w:hAnsi="Times" w:cs="Times"/>
-              </w:rPr>
-            </w:pPr>
-            <w:r>
-              <w:rPr>
                 <w:rFonts w:ascii="Times" w:eastAsiaTheme="minorEastAsia" w:hAnsi="Times" w:cs="Times" w:hint="eastAsia"/>
               </w:rPr>
-              <w:t>292</w:t>
+            </w:pPr>
+            <w:r>
+              <w:rPr>
+                <w:rFonts w:ascii="Times" w:eastAsiaTheme="minorEastAsia" w:hAnsi="Times" w:cs="Times"/>
+              </w:rPr>
+              <w:t>108-110</w:t>
             </w:r>
           </w:p>
         </w:tc>
@@ -1604,20 +1622,14 @@
             <w:pPr>
               <w:jc w:val="center"/>
               <w:rPr>
-                <w:rFonts w:ascii="Times" w:eastAsiaTheme="minorEastAsia" w:hAnsi="Times" w:cs="Times"/>
-              </w:rPr>
-            </w:pPr>
-            <w:r>
-              <w:rPr>
                 <w:rFonts w:ascii="Times" w:eastAsiaTheme="minorEastAsia" w:hAnsi="Times" w:cs="Times" w:hint="eastAsia"/>
               </w:rPr>
-              <w:t>Perc 3-6</w:t>
-            </w:r>
-            <w:r>
-              <w:rPr>
-                <w:rFonts w:ascii="Times" w:eastAsiaTheme="minorEastAsia" w:hAnsi="Times" w:cs="Times"/>
-              </w:rPr>
-              <w:t xml:space="preserve"> </w:t>
+            </w:pPr>
+            <w:r>
+              <w:rPr>
+                <w:rFonts w:ascii="Times" w:eastAsiaTheme="minorEastAsia" w:hAnsi="Times" w:cs="Times"/>
+              </w:rPr>
+              <w:t>QD</w:t>
             </w:r>
           </w:p>
         </w:tc>
@@ -1628,34 +1640,14 @@
           <w:p>
             <w:pPr>
               <w:rPr>
-                <w:rFonts w:ascii="Times" w:eastAsiaTheme="minorEastAsia" w:hAnsi="Times" w:cs="Times"/>
-              </w:rPr>
-            </w:pPr>
-            <w:r>
-              <w:rPr>
                 <w:rFonts w:ascii="Times" w:eastAsiaTheme="minorEastAsia" w:hAnsi="Times" w:cs="Times" w:hint="eastAsia"/>
               </w:rPr>
-              <w:t>Windchimes and Glasschimes are not listed in the instrument list.</w:t>
-            </w:r>
-          </w:p>
-          <w:p>
-            <w:pPr>
-              <w:rPr>
-                <w:rFonts w:ascii="Times" w:eastAsiaTheme="minorEastAsia" w:hAnsi="Times" w:cs="Times"/>
-              </w:rPr>
-            </w:pPr>
-          </w:p>
-          <w:p>
-            <w:pPr>
-              <w:rPr>
-                <w:rFonts w:ascii="Times" w:eastAsiaTheme="minorEastAsia" w:hAnsi="Times" w:cs="Times"/>
-              </w:rPr>
-            </w:pPr>
-            <w:r>
-              <w:rPr>
-                <w:rFonts w:ascii="Times" w:eastAsiaTheme="minorEastAsia" w:hAnsi="Times" w:cs="Times"/>
-              </w:rPr>
-              <w:t xml:space="preserve">Likewise, is glasschime and windchime the same instrument? </w:t>
+            </w:pPr>
+            <w:r>
+              <w:rPr>
+                <w:rFonts w:ascii="Times" w:eastAsiaTheme="minorEastAsia" w:hAnsi="Times" w:cs="Times"/>
+              </w:rPr>
+              <w:t>Assumed missing staccatos?</w:t>
             </w:r>
           </w:p>
         </w:tc>
@@ -1688,16 +1680,14 @@
             <w:pPr>
               <w:jc w:val="center"/>
               <w:rPr>
-                <w:rFonts w:ascii="Times" w:eastAsia="Times" w:hAnsi="Times" w:cs="Times"/>
-                <w:lang w:eastAsia="zh-TW"/>
-              </w:rPr>
-            </w:pPr>
-            <w:r>
-              <w:rPr>
-                <w:rFonts w:ascii="Times" w:eastAsia="Times" w:hAnsi="Times" w:cs="Times"/>
-                <w:lang w:eastAsia="zh-TW"/>
-              </w:rPr>
-              <w:t>188-234</w:t>
+                <w:rFonts w:ascii="Times" w:eastAsiaTheme="minorEastAsia" w:hAnsi="Times" w:cs="Times" w:hint="eastAsia"/>
+              </w:rPr>
+            </w:pPr>
+            <w:r>
+              <w:rPr>
+                <w:rFonts w:ascii="Times" w:eastAsiaTheme="minorEastAsia" w:hAnsi="Times" w:cs="Times"/>
+              </w:rPr>
+              <w:t>150</w:t>
             </w:r>
           </w:p>
         </w:tc>
@@ -1709,17 +1699,23 @@
             <w:pPr>
               <w:jc w:val="center"/>
               <w:rPr>
-                <w:rFonts w:ascii="Times" w:eastAsia="Times" w:hAnsi="Times" w:cs="Times"/>
-                <w:lang w:eastAsia="zh-TW"/>
-              </w:rPr>
-            </w:pPr>
-            <w:r>
-              <w:rPr>
-                <w:rFonts w:ascii="Times" w:eastAsia="Times" w:hAnsi="Times" w:cs="Times"/>
-                <w:lang w:eastAsia="zh-TW"/>
-              </w:rPr>
-              <w:t>Pipa Solo</w:t>
-            </w:r>
+                <w:rFonts w:ascii="Times" w:eastAsiaTheme="minorEastAsia" w:hAnsi="Times" w:cs="Times" w:hint="eastAsia"/>
+              </w:rPr>
+            </w:pPr>
+            <w:r>
+              <w:rPr>
+                <w:rFonts w:ascii="Times" w:eastAsiaTheme="minorEastAsia" w:hAnsi="Times" w:cs="Times"/>
+              </w:rPr>
+              <w:t xml:space="preserve">XD, </w:t>
+            </w:r>
+            <w:proofErr w:type="spellStart"/>
+            <w:r>
+              <w:rPr>
+                <w:rFonts w:ascii="Times" w:eastAsiaTheme="minorEastAsia" w:hAnsi="Times" w:cs="Times"/>
+              </w:rPr>
+              <w:t>GYSh</w:t>
+            </w:r>
+            <w:proofErr w:type="spellEnd"/>
           </w:p>
         </w:tc>
         <w:tc>
@@ -1729,16 +1725,30 @@
           <w:p>
             <w:pPr>
               <w:rPr>
-                <w:rFonts w:ascii="Times" w:eastAsia="Times" w:hAnsi="Times" w:cs="Times"/>
-                <w:lang w:eastAsia="zh-TW"/>
-              </w:rPr>
-            </w:pPr>
-            <w:r>
-              <w:rPr>
-                <w:rFonts w:ascii="Times" w:eastAsia="Times" w:hAnsi="Times" w:cs="Times"/>
-                <w:lang w:eastAsia="zh-TW"/>
-              </w:rPr>
-              <w:t xml:space="preserve">Replaced excessive ledger lines with alternative scoring solutions to make it easier to read. </w:t>
+                <w:rFonts w:ascii="Times" w:eastAsiaTheme="minorEastAsia" w:hAnsi="Times" w:cs="Times" w:hint="eastAsia"/>
+              </w:rPr>
+            </w:pPr>
+            <w:r>
+              <w:rPr>
+                <w:rFonts w:ascii="Times" w:eastAsiaTheme="minorEastAsia" w:hAnsi="Times" w:cs="Times"/>
+              </w:rPr>
+              <w:t xml:space="preserve">Missing </w:t>
+            </w:r>
+            <w:r>
+              <w:rPr>
+                <w:rFonts w:ascii="Times" w:eastAsiaTheme="minorEastAsia" w:hAnsi="Times" w:cs="Times"/>
+                <w:b/>
+                <w:bCs/>
+                <w:i/>
+                <w:iCs/>
+              </w:rPr>
+              <w:t>mf</w:t>
+            </w:r>
+            <w:r>
+              <w:rPr>
+                <w:rFonts w:ascii="Times" w:eastAsiaTheme="minorEastAsia" w:hAnsi="Times" w:cs="Times"/>
+              </w:rPr>
+              <w:t>?</w:t>
             </w:r>
           </w:p>
         </w:tc>
@@ -1751,7 +1761,7 @@
             <w:pPr>
               <w:jc w:val="center"/>
               <w:rPr>
-                <w:rFonts w:ascii="Times New Roman" w:hAnsi="Times New Roman" w:cs="Times New Roman"/>
+                <w:rFonts w:ascii="Times" w:eastAsia="Times" w:hAnsi="Times" w:cs="Times"/>
                 <w:color w:val="FF0000"/>
                 <w:lang w:eastAsia="zh-TW"/>
               </w:rPr>
@@ -1771,16 +1781,14 @@
             <w:pPr>
               <w:jc w:val="center"/>
               <w:rPr>
-                <w:rFonts w:ascii="Times" w:eastAsia="Times" w:hAnsi="Times" w:cs="Times"/>
-                <w:lang w:eastAsia="zh-TW"/>
-              </w:rPr>
-            </w:pPr>
-            <w:r>
-              <w:rPr>
-                <w:rFonts w:ascii="Times" w:eastAsia="Times" w:hAnsi="Times" w:cs="Times"/>
-                <w:lang w:eastAsia="zh-TW"/>
-              </w:rPr>
-              <w:t>293</w:t>
+                <w:rFonts w:ascii="Times" w:eastAsiaTheme="minorEastAsia" w:hAnsi="Times" w:cs="Times"/>
+              </w:rPr>
+            </w:pPr>
+            <w:r>
+              <w:rPr>
+                <w:rFonts w:ascii="Times" w:eastAsiaTheme="minorEastAsia" w:hAnsi="Times" w:cs="Times" w:hint="eastAsia"/>
+              </w:rPr>
+              <w:t>292</w:t>
             </w:r>
           </w:p>
         </w:tc>
@@ -1792,16 +1800,20 @@
             <w:pPr>
               <w:jc w:val="center"/>
               <w:rPr>
-                <w:rFonts w:ascii="Times" w:eastAsia="Times" w:hAnsi="Times" w:cs="Times"/>
-                <w:lang w:val="en-US" w:eastAsia="zh-TW"/>
-              </w:rPr>
-            </w:pPr>
-            <w:r>
-              <w:rPr>
-                <w:rFonts w:ascii="Times" w:eastAsia="Times" w:hAnsi="Times" w:cs="Times"/>
-                <w:lang w:val="en-US" w:eastAsia="zh-TW"/>
-              </w:rPr>
-              <w:t>Contrabass</w:t>
+                <w:rFonts w:ascii="Times" w:eastAsiaTheme="minorEastAsia" w:hAnsi="Times" w:cs="Times"/>
+              </w:rPr>
+            </w:pPr>
+            <w:r>
+              <w:rPr>
+                <w:rFonts w:ascii="Times" w:eastAsiaTheme="minorEastAsia" w:hAnsi="Times" w:cs="Times" w:hint="eastAsia"/>
+              </w:rPr>
+              <w:t>Perc 3-6</w:t>
+            </w:r>
+            <w:r>
+              <w:rPr>
+                <w:rFonts w:ascii="Times" w:eastAsiaTheme="minorEastAsia" w:hAnsi="Times" w:cs="Times"/>
+              </w:rPr>
+              <w:t xml:space="preserve"> </w:t>
             </w:r>
           </w:p>
         </w:tc>
@@ -1812,46 +1824,82 @@
           <w:p>
             <w:pPr>
               <w:rPr>
-                <w:rFonts w:ascii="Times" w:eastAsia="Times" w:hAnsi="Times" w:cs="Times"/>
-                <w:lang w:eastAsia="zh-TW"/>
-              </w:rPr>
-            </w:pPr>
-            <w:r>
-              <w:rPr>
-                <w:rFonts w:ascii="Times" w:eastAsia="Times" w:hAnsi="Times" w:cs="Times"/>
-                <w:lang w:eastAsia="zh-TW"/>
-              </w:rPr>
-              <w:t>Edited sul D 8</w:t>
-            </w:r>
-            <w:r>
-              <w:rPr>
-                <w:rFonts w:ascii="Times" w:eastAsia="Times" w:hAnsi="Times" w:cs="Times"/>
-                <w:vertAlign w:val="superscript"/>
-                <w:lang w:eastAsia="zh-TW"/>
-              </w:rPr>
-              <w:t>th</w:t>
-            </w:r>
-            <w:r>
-              <w:rPr>
-                <w:rFonts w:ascii="Times" w:eastAsia="Times" w:hAnsi="Times" w:cs="Times"/>
-                <w:lang w:eastAsia="zh-TW"/>
-              </w:rPr>
-              <w:t xml:space="preserve"> partial to 6</w:t>
-            </w:r>
-            <w:r>
-              <w:rPr>
-                <w:rFonts w:ascii="Times" w:eastAsia="Times" w:hAnsi="Times" w:cs="Times"/>
-                <w:vertAlign w:val="superscript"/>
-                <w:lang w:eastAsia="zh-TW"/>
-              </w:rPr>
-              <w:t>th</w:t>
-            </w:r>
-            <w:r>
-              <w:rPr>
-                <w:rFonts w:ascii="Times" w:eastAsia="Times" w:hAnsi="Times" w:cs="Times"/>
-                <w:lang w:eastAsia="zh-TW"/>
-              </w:rPr>
-              <w:t xml:space="preserve"> partial on sul G</w:t>
+                <w:rFonts w:ascii="Times" w:eastAsiaTheme="minorEastAsia" w:hAnsi="Times" w:cs="Times"/>
+              </w:rPr>
+            </w:pPr>
+            <w:r>
+              <w:rPr>
+                <w:rFonts w:ascii="Times" w:eastAsiaTheme="minorEastAsia" w:hAnsi="Times" w:cs="Times" w:hint="eastAsia"/>
+              </w:rPr>
+              <w:t>Windchimes and Glass</w:t>
+            </w:r>
+            <w:r>
+              <w:rPr>
+                <w:rFonts w:ascii="Times" w:eastAsiaTheme="minorEastAsia" w:hAnsi="Times" w:cs="Times"/>
+              </w:rPr>
+              <w:t xml:space="preserve"> </w:t>
+            </w:r>
+            <w:r>
+              <w:rPr>
+                <w:rFonts w:ascii="Times" w:eastAsiaTheme="minorEastAsia" w:hAnsi="Times" w:cs="Times" w:hint="eastAsia"/>
+              </w:rPr>
+              <w:t>chimes are not listed in the instrument list.</w:t>
+            </w:r>
+          </w:p>
+          <w:p>
+            <w:pPr>
+              <w:rPr>
+                <w:rFonts w:ascii="Times" w:eastAsiaTheme="minorEastAsia" w:hAnsi="Times" w:cs="Times"/>
+              </w:rPr>
+            </w:pPr>
+          </w:p>
+          <w:p>
+            <w:pPr>
+              <w:rPr>
+                <w:rFonts w:ascii="Times" w:eastAsiaTheme="minorEastAsia" w:hAnsi="Times" w:cs="Times"/>
+              </w:rPr>
+            </w:pPr>
+            <w:r>
+              <w:rPr>
+                <w:rFonts w:ascii="Times" w:eastAsiaTheme="minorEastAsia" w:hAnsi="Times" w:cs="Times"/>
+              </w:rPr>
+              <w:t>Likewise, is glass</w:t>
+            </w:r>
+            <w:r>
+              <w:rPr>
+                <w:rFonts w:ascii="Times" w:eastAsiaTheme="minorEastAsia" w:hAnsi="Times" w:cs="Times"/>
+              </w:rPr>
+              <w:t xml:space="preserve"> </w:t>
+            </w:r>
+            <w:r>
+              <w:rPr>
+                <w:rFonts w:ascii="Times" w:eastAsiaTheme="minorEastAsia" w:hAnsi="Times" w:cs="Times"/>
+              </w:rPr>
+              <w:t xml:space="preserve">chime and windchime </w:t>
+            </w:r>
+            <w:r>
+              <w:rPr>
+                <w:rFonts w:ascii="Times" w:eastAsiaTheme="minorEastAsia" w:hAnsi="Times" w:cs="Times"/>
+              </w:rPr>
+              <w:t xml:space="preserve">mean to be the </w:t>
+            </w:r>
+            <w:r>
+              <w:rPr>
+                <w:rFonts w:ascii="Times" w:eastAsiaTheme="minorEastAsia" w:hAnsi="Times" w:cs="Times"/>
+              </w:rPr>
+              <w:t>same instrument?</w:t>
+            </w:r>
+            <w:r>
+              <w:rPr>
+                <w:rFonts w:ascii="Times" w:eastAsiaTheme="minorEastAsia" w:hAnsi="Times" w:cs="Times"/>
+              </w:rPr>
+              <w:t xml:space="preserve"> Their Chinese translations have them the same. </w:t>
+            </w:r>
+            <w:r>
+              <w:rPr>
+                <w:rFonts w:ascii="Times" w:eastAsiaTheme="minorEastAsia" w:hAnsi="Times" w:cs="Times"/>
+              </w:rPr>
+              <w:t xml:space="preserve"> </w:t>
             </w:r>
           </w:p>
         </w:tc>
@@ -1864,7 +1912,7 @@
             <w:pPr>
               <w:jc w:val="center"/>
               <w:rPr>
-                <w:rFonts w:ascii="Times New Roman" w:hAnsi="Times New Roman" w:cs="Times New Roman"/>
+                <w:rFonts w:ascii="Times" w:eastAsia="Times" w:hAnsi="Times" w:cs="Times"/>
                 <w:color w:val="FF0000"/>
                 <w:lang w:eastAsia="zh-TW"/>
               </w:rPr>
@@ -1893,6 +1941,89 @@
                 <w:rFonts w:ascii="Times" w:eastAsia="Times" w:hAnsi="Times" w:cs="Times"/>
                 <w:lang w:eastAsia="zh-TW"/>
               </w:rPr>
+              <w:t>188-234</w:t>
+            </w:r>
+          </w:p>
+        </w:tc>
+        <w:tc>
+          <w:tcPr>
+            <w:tcW w:w="1985" w:type="dxa"/>
+          </w:tcPr>
+          <w:p>
+            <w:pPr>
+              <w:jc w:val="center"/>
+              <w:rPr>
+                <w:rFonts w:ascii="Times" w:eastAsia="Times" w:hAnsi="Times" w:cs="Times"/>
+                <w:lang w:eastAsia="zh-TW"/>
+              </w:rPr>
+            </w:pPr>
+            <w:r>
+              <w:rPr>
+                <w:rFonts w:ascii="Times" w:eastAsia="Times" w:hAnsi="Times" w:cs="Times"/>
+                <w:lang w:eastAsia="zh-TW"/>
+              </w:rPr>
+              <w:t>Pipa Solo</w:t>
+            </w:r>
+          </w:p>
+        </w:tc>
+        <w:tc>
+          <w:tcPr>
+            <w:tcW w:w="2977" w:type="dxa"/>
+          </w:tcPr>
+          <w:p>
+            <w:pPr>
+              <w:rPr>
+                <w:rFonts w:ascii="Times" w:eastAsia="Times" w:hAnsi="Times" w:cs="Times"/>
+                <w:lang w:eastAsia="zh-TW"/>
+              </w:rPr>
+            </w:pPr>
+            <w:r>
+              <w:rPr>
+                <w:rFonts w:ascii="Times" w:eastAsia="Times" w:hAnsi="Times" w:cs="Times"/>
+                <w:lang w:eastAsia="zh-TW"/>
+              </w:rPr>
+              <w:t xml:space="preserve">Replaced excessive ledger lines with alternative scoring solutions to make it easier to read. </w:t>
+            </w:r>
+          </w:p>
+        </w:tc>
+        <w:tc>
+          <w:tcPr>
+            <w:tcW w:w="2994" w:type="dxa"/>
+            <w:vAlign w:val="center"/>
+          </w:tcPr>
+          <w:p>
+            <w:pPr>
+              <w:jc w:val="center"/>
+              <w:rPr>
+                <w:rFonts w:ascii="Times New Roman" w:hAnsi="Times New Roman" w:cs="Times New Roman"/>
+                <w:color w:val="FF0000"/>
+                <w:lang w:eastAsia="zh-TW"/>
+              </w:rPr>
+            </w:pPr>
+          </w:p>
+        </w:tc>
+      </w:tr>
+      <w:tr>
+        <w:trPr>
+          <w:trHeight w:val="552"/>
+        </w:trPr>
+        <w:tc>
+          <w:tcPr>
+            <w:tcW w:w="1129" w:type="dxa"/>
+          </w:tcPr>
+          <w:p>
+            <w:pPr>
+              <w:jc w:val="center"/>
+              <w:rPr>
+                <w:rFonts w:ascii="Times" w:eastAsia="Times" w:hAnsi="Times" w:cs="Times"/>
+                <w:lang w:eastAsia="zh-TW"/>
+              </w:rPr>
+            </w:pPr>
+            <w:r>
+              <w:rPr>
+                <w:rFonts w:ascii="Times" w:eastAsia="Times" w:hAnsi="Times" w:cs="Times"/>
+                <w:lang w:eastAsia="zh-TW"/>
+              </w:rPr>
               <w:t>293</w:t>
             </w:r>
           </w:p>
@@ -1906,6 +2037,119 @@
               <w:jc w:val="center"/>
               <w:rPr>
                 <w:rFonts w:ascii="Times" w:eastAsia="Times" w:hAnsi="Times" w:cs="Times"/>
+                <w:lang w:val="en-US" w:eastAsia="zh-TW"/>
+              </w:rPr>
+            </w:pPr>
+            <w:r>
+              <w:rPr>
+                <w:rFonts w:ascii="Times" w:eastAsia="Times" w:hAnsi="Times" w:cs="Times"/>
+                <w:lang w:val="en-US" w:eastAsia="zh-TW"/>
+              </w:rPr>
+              <w:t>Contrabass</w:t>
+            </w:r>
+          </w:p>
+        </w:tc>
+        <w:tc>
+          <w:tcPr>
+            <w:tcW w:w="2977" w:type="dxa"/>
+          </w:tcPr>
+          <w:p>
+            <w:pPr>
+              <w:rPr>
+                <w:rFonts w:ascii="Times" w:eastAsia="Times" w:hAnsi="Times" w:cs="Times"/>
+                <w:lang w:eastAsia="zh-TW"/>
+              </w:rPr>
+            </w:pPr>
+            <w:r>
+              <w:rPr>
+                <w:rFonts w:ascii="Times" w:eastAsia="Times" w:hAnsi="Times" w:cs="Times"/>
+                <w:lang w:eastAsia="zh-TW"/>
+              </w:rPr>
+              <w:t>Edited sul D 8</w:t>
+            </w:r>
+            <w:r>
+              <w:rPr>
+                <w:rFonts w:ascii="Times" w:eastAsia="Times" w:hAnsi="Times" w:cs="Times"/>
+                <w:vertAlign w:val="superscript"/>
+                <w:lang w:eastAsia="zh-TW"/>
+              </w:rPr>
+              <w:t>th</w:t>
+            </w:r>
+            <w:r>
+              <w:rPr>
+                <w:rFonts w:ascii="Times" w:eastAsia="Times" w:hAnsi="Times" w:cs="Times"/>
+                <w:lang w:eastAsia="zh-TW"/>
+              </w:rPr>
+              <w:t xml:space="preserve"> partial to 6</w:t>
+            </w:r>
+            <w:r>
+              <w:rPr>
+                <w:rFonts w:ascii="Times" w:eastAsia="Times" w:hAnsi="Times" w:cs="Times"/>
+                <w:vertAlign w:val="superscript"/>
+                <w:lang w:eastAsia="zh-TW"/>
+              </w:rPr>
+              <w:t>th</w:t>
+            </w:r>
+            <w:r>
+              <w:rPr>
+                <w:rFonts w:ascii="Times" w:eastAsia="Times" w:hAnsi="Times" w:cs="Times"/>
+                <w:lang w:eastAsia="zh-TW"/>
+              </w:rPr>
+              <w:t xml:space="preserve"> partial on sul G</w:t>
+            </w:r>
+          </w:p>
+        </w:tc>
+        <w:tc>
+          <w:tcPr>
+            <w:tcW w:w="2994" w:type="dxa"/>
+            <w:vAlign w:val="center"/>
+          </w:tcPr>
+          <w:p>
+            <w:pPr>
+              <w:jc w:val="center"/>
+              <w:rPr>
+                <w:rFonts w:ascii="Times New Roman" w:hAnsi="Times New Roman" w:cs="Times New Roman"/>
+                <w:color w:val="FF0000"/>
+                <w:lang w:eastAsia="zh-TW"/>
+              </w:rPr>
+            </w:pPr>
+          </w:p>
+        </w:tc>
+      </w:tr>
+      <w:tr>
+        <w:trPr>
+          <w:trHeight w:val="552"/>
+        </w:trPr>
+        <w:tc>
+          <w:tcPr>
+            <w:tcW w:w="1129" w:type="dxa"/>
+          </w:tcPr>
+          <w:p>
+            <w:pPr>
+              <w:jc w:val="center"/>
+              <w:rPr>
+                <w:rFonts w:ascii="Times" w:eastAsia="Times" w:hAnsi="Times" w:cs="Times"/>
+                <w:lang w:eastAsia="zh-TW"/>
+              </w:rPr>
+            </w:pPr>
+            <w:r>
+              <w:rPr>
+                <w:rFonts w:ascii="Times" w:eastAsia="Times" w:hAnsi="Times" w:cs="Times"/>
+                <w:lang w:eastAsia="zh-TW"/>
+              </w:rPr>
+              <w:t>293</w:t>
+            </w:r>
+          </w:p>
+        </w:tc>
+        <w:tc>
+          <w:tcPr>
+            <w:tcW w:w="1985" w:type="dxa"/>
+          </w:tcPr>
+          <w:p>
+            <w:pPr>
+              <w:jc w:val="center"/>
+              <w:rPr>
+                <w:rFonts w:ascii="Times" w:eastAsia="Times" w:hAnsi="Times" w:cs="Times"/>
                 <w:lang w:eastAsia="zh-TW"/>
               </w:rPr>
             </w:pPr>
@@ -1916,13 +2160,31 @@
               </w:rPr>
               <w:t xml:space="preserve">GH, EH, ZH, </w:t>
             </w:r>
-            <w:r>
-              <w:rPr>
-                <w:rFonts w:ascii="Times" w:eastAsia="Times" w:hAnsi="Times" w:cs="Times"/>
-                <w:lang w:eastAsia="zh-TW"/>
-              </w:rPr>
-              <w:t>Vc, Cb</w:t>
-            </w:r>
+            <w:proofErr w:type="spellStart"/>
+            <w:r>
+              <w:rPr>
+                <w:rFonts w:ascii="Times" w:eastAsia="Times" w:hAnsi="Times" w:cs="Times"/>
+                <w:lang w:eastAsia="zh-TW"/>
+              </w:rPr>
+              <w:t>Vc</w:t>
+            </w:r>
+            <w:proofErr w:type="spellEnd"/>
+            <w:r>
+              <w:rPr>
+                <w:rFonts w:ascii="Times" w:eastAsia="Times" w:hAnsi="Times" w:cs="Times"/>
+                <w:lang w:eastAsia="zh-TW"/>
+              </w:rPr>
+              <w:t xml:space="preserve">, </w:t>
+            </w:r>
+            <w:proofErr w:type="spellStart"/>
+            <w:r>
+              <w:rPr>
+                <w:rFonts w:ascii="Times" w:eastAsia="Times" w:hAnsi="Times" w:cs="Times"/>
+                <w:lang w:eastAsia="zh-TW"/>
+              </w:rPr>
+              <w:t>Cb</w:t>
+            </w:r>
+            <w:proofErr w:type="spellEnd"/>
           </w:p>
         </w:tc>
         <w:tc>

</xml_diff>

<commit_message>
All pages of Piece 7 reviewed entirely.
</commit_message>
<xml_diff>
--- a/Working Folder/7 Gordon Fung 冯迪伦 - Arise, You Lion of Glory! 狮舞弄清韻/7 Gordon Fung 冯迪伦 - Arise, You Lion of Glory! 狮舞弄清韻 - Errata_v1.docx
+++ b/Working Folder/7 Gordon Fung 冯迪伦 - Arise, You Lion of Glory! 狮舞弄清韻/7 Gordon Fung 冯迪伦 - Arise, You Lion of Glory! 狮舞弄清韻 - Errata_v1.docx
@@ -1265,23 +1265,7 @@
                 <w:rFonts w:ascii="Times" w:eastAsia="Times" w:hAnsi="Times" w:cs="Times"/>
                 <w:lang w:eastAsia="zh-TW"/>
               </w:rPr>
-              <w:t xml:space="preserve">Tempo 60 = </w:t>
-            </w:r>
-            <w:proofErr w:type="spellStart"/>
-            <w:r>
-              <w:rPr>
-                <w:rFonts w:ascii="Times" w:eastAsia="Times" w:hAnsi="Times" w:cs="Times"/>
-                <w:lang w:eastAsia="zh-TW"/>
-              </w:rPr>
-              <w:t>tuplet</w:t>
-            </w:r>
-            <w:proofErr w:type="spellEnd"/>
-            <w:r>
-              <w:rPr>
-                <w:rFonts w:ascii="Times" w:eastAsia="Times" w:hAnsi="Times" w:cs="Times"/>
-                <w:lang w:eastAsia="zh-TW"/>
-              </w:rPr>
-              <w:t>?</w:t>
+              <w:t>Tempo 60 = tuplet?</w:t>
             </w:r>
           </w:p>
         </w:tc>
@@ -1384,7 +1368,6 @@
               </w:rPr>
               <w:t xml:space="preserve"> </w:t>
             </w:r>
-            <w:proofErr w:type="spellStart"/>
             <w:r>
               <w:rPr>
                 <w:rFonts w:ascii="Times" w:eastAsiaTheme="minorEastAsia" w:hAnsi="Times" w:cs="Times"/>
@@ -1395,7 +1378,6 @@
               </w:rPr>
               <w:t>sfz</w:t>
             </w:r>
-            <w:proofErr w:type="spellEnd"/>
             <w:r>
               <w:rPr>
                 <w:rFonts w:ascii="Times" w:eastAsiaTheme="minorEastAsia" w:hAnsi="Times" w:cs="Times"/>
@@ -1706,16 +1688,8 @@
               <w:rPr>
                 <w:rFonts w:ascii="Times" w:eastAsiaTheme="minorEastAsia" w:hAnsi="Times" w:cs="Times"/>
               </w:rPr>
-              <w:t xml:space="preserve">XD, </w:t>
-            </w:r>
-            <w:proofErr w:type="spellStart"/>
-            <w:r>
-              <w:rPr>
-                <w:rFonts w:ascii="Times" w:eastAsiaTheme="minorEastAsia" w:hAnsi="Times" w:cs="Times"/>
-              </w:rPr>
-              <w:t>GYSh</w:t>
-            </w:r>
-            <w:proofErr w:type="spellEnd"/>
+              <w:t>XD, GYSh</w:t>
+            </w:r>
           </w:p>
         </w:tc>
         <w:tc>
@@ -1781,14 +1755,14 @@
             <w:pPr>
               <w:jc w:val="center"/>
               <w:rPr>
-                <w:rFonts w:ascii="Times" w:eastAsiaTheme="minorEastAsia" w:hAnsi="Times" w:cs="Times"/>
-              </w:rPr>
-            </w:pPr>
-            <w:r>
-              <w:rPr>
                 <w:rFonts w:ascii="Times" w:eastAsiaTheme="minorEastAsia" w:hAnsi="Times" w:cs="Times" w:hint="eastAsia"/>
               </w:rPr>
-              <w:t>292</w:t>
+            </w:pPr>
+            <w:r>
+              <w:rPr>
+                <w:rFonts w:ascii="Times" w:eastAsiaTheme="minorEastAsia" w:hAnsi="Times" w:cs="Times"/>
+              </w:rPr>
+              <w:t>169</w:t>
             </w:r>
           </w:p>
         </w:tc>
@@ -1800,20 +1774,14 @@
             <w:pPr>
               <w:jc w:val="center"/>
               <w:rPr>
-                <w:rFonts w:ascii="Times" w:eastAsiaTheme="minorEastAsia" w:hAnsi="Times" w:cs="Times"/>
-              </w:rPr>
-            </w:pPr>
-            <w:r>
-              <w:rPr>
                 <w:rFonts w:ascii="Times" w:eastAsiaTheme="minorEastAsia" w:hAnsi="Times" w:cs="Times" w:hint="eastAsia"/>
               </w:rPr>
-              <w:t>Perc 3-6</w:t>
-            </w:r>
-            <w:r>
-              <w:rPr>
-                <w:rFonts w:ascii="Times" w:eastAsiaTheme="minorEastAsia" w:hAnsi="Times" w:cs="Times"/>
-              </w:rPr>
-              <w:t xml:space="preserve"> </w:t>
+            </w:pPr>
+            <w:r>
+              <w:rPr>
+                <w:rFonts w:ascii="Times" w:eastAsiaTheme="minorEastAsia" w:hAnsi="Times" w:cs="Times"/>
+              </w:rPr>
+              <w:t>Pipa Solo</w:t>
             </w:r>
           </w:p>
         </w:tc>
@@ -1824,82 +1792,30 @@
           <w:p>
             <w:pPr>
               <w:rPr>
-                <w:rFonts w:ascii="Times" w:eastAsiaTheme="minorEastAsia" w:hAnsi="Times" w:cs="Times"/>
-              </w:rPr>
-            </w:pPr>
-            <w:r>
-              <w:rPr>
                 <w:rFonts w:ascii="Times" w:eastAsiaTheme="minorEastAsia" w:hAnsi="Times" w:cs="Times" w:hint="eastAsia"/>
               </w:rPr>
-              <w:t>Windchimes and Glass</w:t>
-            </w:r>
-            <w:r>
-              <w:rPr>
-                <w:rFonts w:ascii="Times" w:eastAsiaTheme="minorEastAsia" w:hAnsi="Times" w:cs="Times"/>
-              </w:rPr>
-              <w:t xml:space="preserve"> </w:t>
-            </w:r>
-            <w:r>
-              <w:rPr>
-                <w:rFonts w:ascii="Times" w:eastAsiaTheme="minorEastAsia" w:hAnsi="Times" w:cs="Times" w:hint="eastAsia"/>
-              </w:rPr>
-              <w:t>chimes are not listed in the instrument list.</w:t>
-            </w:r>
-          </w:p>
-          <w:p>
-            <w:pPr>
-              <w:rPr>
-                <w:rFonts w:ascii="Times" w:eastAsiaTheme="minorEastAsia" w:hAnsi="Times" w:cs="Times"/>
-              </w:rPr>
-            </w:pPr>
-          </w:p>
-          <w:p>
-            <w:pPr>
-              <w:rPr>
-                <w:rFonts w:ascii="Times" w:eastAsiaTheme="minorEastAsia" w:hAnsi="Times" w:cs="Times"/>
-              </w:rPr>
-            </w:pPr>
-            <w:r>
-              <w:rPr>
-                <w:rFonts w:ascii="Times" w:eastAsiaTheme="minorEastAsia" w:hAnsi="Times" w:cs="Times"/>
-              </w:rPr>
-              <w:t>Likewise, is glass</w:t>
-            </w:r>
-            <w:r>
-              <w:rPr>
-                <w:rFonts w:ascii="Times" w:eastAsiaTheme="minorEastAsia" w:hAnsi="Times" w:cs="Times"/>
-              </w:rPr>
-              <w:t xml:space="preserve"> </w:t>
-            </w:r>
-            <w:r>
-              <w:rPr>
-                <w:rFonts w:ascii="Times" w:eastAsiaTheme="minorEastAsia" w:hAnsi="Times" w:cs="Times"/>
-              </w:rPr>
-              <w:t xml:space="preserve">chime and windchime </w:t>
-            </w:r>
-            <w:r>
-              <w:rPr>
-                <w:rFonts w:ascii="Times" w:eastAsiaTheme="minorEastAsia" w:hAnsi="Times" w:cs="Times"/>
-              </w:rPr>
-              <w:t xml:space="preserve">mean to be the </w:t>
-            </w:r>
-            <w:r>
-              <w:rPr>
-                <w:rFonts w:ascii="Times" w:eastAsiaTheme="minorEastAsia" w:hAnsi="Times" w:cs="Times"/>
-              </w:rPr>
-              <w:t>same instrument?</w:t>
-            </w:r>
-            <w:r>
-              <w:rPr>
-                <w:rFonts w:ascii="Times" w:eastAsiaTheme="minorEastAsia" w:hAnsi="Times" w:cs="Times"/>
-              </w:rPr>
-              <w:t xml:space="preserve"> Their Chinese translations have them the same. </w:t>
-            </w:r>
-            <w:r>
-              <w:rPr>
-                <w:rFonts w:ascii="Times" w:eastAsiaTheme="minorEastAsia" w:hAnsi="Times" w:cs="Times"/>
-              </w:rPr>
-              <w:t xml:space="preserve"> </w:t>
+            </w:pPr>
+            <w:r>
+              <w:rPr>
+                <w:rFonts w:ascii="Times" w:eastAsiaTheme="minorEastAsia" w:hAnsi="Times" w:cs="Times"/>
+              </w:rPr>
+              <w:t xml:space="preserve">Missing </w:t>
+            </w:r>
+            <w:r>
+              <w:rPr>
+                <w:rFonts w:ascii="Times" w:eastAsiaTheme="minorEastAsia" w:hAnsi="Times" w:cs="Times"/>
+                <w:b/>
+                <w:bCs/>
+                <w:i/>
+                <w:iCs/>
+              </w:rPr>
+              <w:t>mf</w:t>
+            </w:r>
+            <w:r>
+              <w:rPr>
+                <w:rFonts w:ascii="Times" w:eastAsiaTheme="minorEastAsia" w:hAnsi="Times" w:cs="Times"/>
+              </w:rPr>
+              <w:t>?</w:t>
             </w:r>
           </w:p>
         </w:tc>
@@ -1932,16 +1848,14 @@
             <w:pPr>
               <w:jc w:val="center"/>
               <w:rPr>
-                <w:rFonts w:ascii="Times" w:eastAsia="Times" w:hAnsi="Times" w:cs="Times"/>
-                <w:lang w:eastAsia="zh-TW"/>
-              </w:rPr>
-            </w:pPr>
-            <w:r>
-              <w:rPr>
-                <w:rFonts w:ascii="Times" w:eastAsia="Times" w:hAnsi="Times" w:cs="Times"/>
-                <w:lang w:eastAsia="zh-TW"/>
-              </w:rPr>
-              <w:t>188-234</w:t>
+                <w:rFonts w:ascii="Times" w:eastAsiaTheme="minorEastAsia" w:hAnsi="Times" w:cs="Times"/>
+              </w:rPr>
+            </w:pPr>
+            <w:r>
+              <w:rPr>
+                <w:rFonts w:ascii="Times" w:eastAsiaTheme="minorEastAsia" w:hAnsi="Times" w:cs="Times" w:hint="eastAsia"/>
+              </w:rPr>
+              <w:t>292</w:t>
             </w:r>
           </w:p>
         </w:tc>
@@ -1953,16 +1867,20 @@
             <w:pPr>
               <w:jc w:val="center"/>
               <w:rPr>
-                <w:rFonts w:ascii="Times" w:eastAsia="Times" w:hAnsi="Times" w:cs="Times"/>
-                <w:lang w:eastAsia="zh-TW"/>
-              </w:rPr>
-            </w:pPr>
-            <w:r>
-              <w:rPr>
-                <w:rFonts w:ascii="Times" w:eastAsia="Times" w:hAnsi="Times" w:cs="Times"/>
-                <w:lang w:eastAsia="zh-TW"/>
-              </w:rPr>
-              <w:t>Pipa Solo</w:t>
+                <w:rFonts w:ascii="Times" w:eastAsiaTheme="minorEastAsia" w:hAnsi="Times" w:cs="Times"/>
+              </w:rPr>
+            </w:pPr>
+            <w:r>
+              <w:rPr>
+                <w:rFonts w:ascii="Times" w:eastAsiaTheme="minorEastAsia" w:hAnsi="Times" w:cs="Times" w:hint="eastAsia"/>
+              </w:rPr>
+              <w:t>Perc 3-6</w:t>
+            </w:r>
+            <w:r>
+              <w:rPr>
+                <w:rFonts w:ascii="Times" w:eastAsiaTheme="minorEastAsia" w:hAnsi="Times" w:cs="Times"/>
+              </w:rPr>
+              <w:t xml:space="preserve"> </w:t>
             </w:r>
           </w:p>
         </w:tc>
@@ -1973,16 +1891,82 @@
           <w:p>
             <w:pPr>
               <w:rPr>
-                <w:rFonts w:ascii="Times" w:eastAsia="Times" w:hAnsi="Times" w:cs="Times"/>
-                <w:lang w:eastAsia="zh-TW"/>
-              </w:rPr>
-            </w:pPr>
-            <w:r>
-              <w:rPr>
-                <w:rFonts w:ascii="Times" w:eastAsia="Times" w:hAnsi="Times" w:cs="Times"/>
-                <w:lang w:eastAsia="zh-TW"/>
-              </w:rPr>
-              <w:t xml:space="preserve">Replaced excessive ledger lines with alternative scoring solutions to make it easier to read. </w:t>
+                <w:rFonts w:ascii="Times" w:eastAsiaTheme="minorEastAsia" w:hAnsi="Times" w:cs="Times"/>
+              </w:rPr>
+            </w:pPr>
+            <w:r>
+              <w:rPr>
+                <w:rFonts w:ascii="Times" w:eastAsiaTheme="minorEastAsia" w:hAnsi="Times" w:cs="Times" w:hint="eastAsia"/>
+              </w:rPr>
+              <w:t>Windchimes and Glass</w:t>
+            </w:r>
+            <w:r>
+              <w:rPr>
+                <w:rFonts w:ascii="Times" w:eastAsiaTheme="minorEastAsia" w:hAnsi="Times" w:cs="Times"/>
+              </w:rPr>
+              <w:t xml:space="preserve"> </w:t>
+            </w:r>
+            <w:r>
+              <w:rPr>
+                <w:rFonts w:ascii="Times" w:eastAsiaTheme="minorEastAsia" w:hAnsi="Times" w:cs="Times" w:hint="eastAsia"/>
+              </w:rPr>
+              <w:t>chimes are not listed in the instrument list.</w:t>
+            </w:r>
+          </w:p>
+          <w:p>
+            <w:pPr>
+              <w:rPr>
+                <w:rFonts w:ascii="Times" w:eastAsiaTheme="minorEastAsia" w:hAnsi="Times" w:cs="Times"/>
+              </w:rPr>
+            </w:pPr>
+          </w:p>
+          <w:p>
+            <w:pPr>
+              <w:rPr>
+                <w:rFonts w:ascii="Times" w:eastAsiaTheme="minorEastAsia" w:hAnsi="Times" w:cs="Times"/>
+              </w:rPr>
+            </w:pPr>
+            <w:r>
+              <w:rPr>
+                <w:rFonts w:ascii="Times" w:eastAsiaTheme="minorEastAsia" w:hAnsi="Times" w:cs="Times"/>
+              </w:rPr>
+              <w:t>Likewise, is glass</w:t>
+            </w:r>
+            <w:r>
+              <w:rPr>
+                <w:rFonts w:ascii="Times" w:eastAsiaTheme="minorEastAsia" w:hAnsi="Times" w:cs="Times"/>
+              </w:rPr>
+              <w:t xml:space="preserve"> </w:t>
+            </w:r>
+            <w:r>
+              <w:rPr>
+                <w:rFonts w:ascii="Times" w:eastAsiaTheme="minorEastAsia" w:hAnsi="Times" w:cs="Times"/>
+              </w:rPr>
+              <w:t xml:space="preserve">chime and windchime </w:t>
+            </w:r>
+            <w:r>
+              <w:rPr>
+                <w:rFonts w:ascii="Times" w:eastAsiaTheme="minorEastAsia" w:hAnsi="Times" w:cs="Times"/>
+              </w:rPr>
+              <w:t xml:space="preserve">mean to be the </w:t>
+            </w:r>
+            <w:r>
+              <w:rPr>
+                <w:rFonts w:ascii="Times" w:eastAsiaTheme="minorEastAsia" w:hAnsi="Times" w:cs="Times"/>
+              </w:rPr>
+              <w:t>same instrument?</w:t>
+            </w:r>
+            <w:r>
+              <w:rPr>
+                <w:rFonts w:ascii="Times" w:eastAsiaTheme="minorEastAsia" w:hAnsi="Times" w:cs="Times"/>
+              </w:rPr>
+              <w:t xml:space="preserve"> Their Chinese translations have them the same. </w:t>
+            </w:r>
+            <w:r>
+              <w:rPr>
+                <w:rFonts w:ascii="Times" w:eastAsiaTheme="minorEastAsia" w:hAnsi="Times" w:cs="Times"/>
+              </w:rPr>
+              <w:t xml:space="preserve"> </w:t>
             </w:r>
           </w:p>
         </w:tc>
@@ -1995,7 +1979,7 @@
             <w:pPr>
               <w:jc w:val="center"/>
               <w:rPr>
-                <w:rFonts w:ascii="Times New Roman" w:hAnsi="Times New Roman" w:cs="Times New Roman"/>
+                <w:rFonts w:ascii="Times" w:eastAsia="Times" w:hAnsi="Times" w:cs="Times"/>
                 <w:color w:val="FF0000"/>
                 <w:lang w:eastAsia="zh-TW"/>
               </w:rPr>
@@ -2024,7 +2008,7 @@
                 <w:rFonts w:ascii="Times" w:eastAsia="Times" w:hAnsi="Times" w:cs="Times"/>
                 <w:lang w:eastAsia="zh-TW"/>
               </w:rPr>
-              <w:t>293</w:t>
+              <w:t>188-234</w:t>
             </w:r>
           </w:p>
         </w:tc>
@@ -2037,15 +2021,15 @@
               <w:jc w:val="center"/>
               <w:rPr>
                 <w:rFonts w:ascii="Times" w:eastAsia="Times" w:hAnsi="Times" w:cs="Times"/>
-                <w:lang w:val="en-US" w:eastAsia="zh-TW"/>
-              </w:rPr>
-            </w:pPr>
-            <w:r>
-              <w:rPr>
-                <w:rFonts w:ascii="Times" w:eastAsia="Times" w:hAnsi="Times" w:cs="Times"/>
-                <w:lang w:val="en-US" w:eastAsia="zh-TW"/>
-              </w:rPr>
-              <w:t>Contrabass</w:t>
+                <w:lang w:eastAsia="zh-TW"/>
+              </w:rPr>
+            </w:pPr>
+            <w:r>
+              <w:rPr>
+                <w:rFonts w:ascii="Times" w:eastAsia="Times" w:hAnsi="Times" w:cs="Times"/>
+                <w:lang w:eastAsia="zh-TW"/>
+              </w:rPr>
+              <w:t>Pipa Solo</w:t>
             </w:r>
           </w:p>
         </w:tc>
@@ -2065,37 +2049,7 @@
                 <w:rFonts w:ascii="Times" w:eastAsia="Times" w:hAnsi="Times" w:cs="Times"/>
                 <w:lang w:eastAsia="zh-TW"/>
               </w:rPr>
-              <w:t>Edited sul D 8</w:t>
-            </w:r>
-            <w:r>
-              <w:rPr>
-                <w:rFonts w:ascii="Times" w:eastAsia="Times" w:hAnsi="Times" w:cs="Times"/>
-                <w:vertAlign w:val="superscript"/>
-                <w:lang w:eastAsia="zh-TW"/>
-              </w:rPr>
-              <w:t>th</w:t>
-            </w:r>
-            <w:r>
-              <w:rPr>
-                <w:rFonts w:ascii="Times" w:eastAsia="Times" w:hAnsi="Times" w:cs="Times"/>
-                <w:lang w:eastAsia="zh-TW"/>
-              </w:rPr>
-              <w:t xml:space="preserve"> partial to 6</w:t>
-            </w:r>
-            <w:r>
-              <w:rPr>
-                <w:rFonts w:ascii="Times" w:eastAsia="Times" w:hAnsi="Times" w:cs="Times"/>
-                <w:vertAlign w:val="superscript"/>
-                <w:lang w:eastAsia="zh-TW"/>
-              </w:rPr>
-              <w:t>th</w:t>
-            </w:r>
-            <w:r>
-              <w:rPr>
-                <w:rFonts w:ascii="Times" w:eastAsia="Times" w:hAnsi="Times" w:cs="Times"/>
-                <w:lang w:eastAsia="zh-TW"/>
-              </w:rPr>
-              <w:t xml:space="preserve"> partial on sul G</w:t>
+              <w:t xml:space="preserve">Replaced excessive ledger lines with alternative scoring solutions to make it easier to read. </w:t>
             </w:r>
           </w:p>
         </w:tc>
@@ -2150,6 +2104,119 @@
               <w:jc w:val="center"/>
               <w:rPr>
                 <w:rFonts w:ascii="Times" w:eastAsia="Times" w:hAnsi="Times" w:cs="Times"/>
+                <w:lang w:val="en-US" w:eastAsia="zh-TW"/>
+              </w:rPr>
+            </w:pPr>
+            <w:r>
+              <w:rPr>
+                <w:rFonts w:ascii="Times" w:eastAsia="Times" w:hAnsi="Times" w:cs="Times"/>
+                <w:lang w:val="en-US" w:eastAsia="zh-TW"/>
+              </w:rPr>
+              <w:t>Contrabass</w:t>
+            </w:r>
+          </w:p>
+        </w:tc>
+        <w:tc>
+          <w:tcPr>
+            <w:tcW w:w="2977" w:type="dxa"/>
+          </w:tcPr>
+          <w:p>
+            <w:pPr>
+              <w:rPr>
+                <w:rFonts w:ascii="Times" w:eastAsia="Times" w:hAnsi="Times" w:cs="Times"/>
+                <w:lang w:eastAsia="zh-TW"/>
+              </w:rPr>
+            </w:pPr>
+            <w:r>
+              <w:rPr>
+                <w:rFonts w:ascii="Times" w:eastAsia="Times" w:hAnsi="Times" w:cs="Times"/>
+                <w:lang w:eastAsia="zh-TW"/>
+              </w:rPr>
+              <w:t>Edited sul D 8</w:t>
+            </w:r>
+            <w:r>
+              <w:rPr>
+                <w:rFonts w:ascii="Times" w:eastAsia="Times" w:hAnsi="Times" w:cs="Times"/>
+                <w:vertAlign w:val="superscript"/>
+                <w:lang w:eastAsia="zh-TW"/>
+              </w:rPr>
+              <w:t>th</w:t>
+            </w:r>
+            <w:r>
+              <w:rPr>
+                <w:rFonts w:ascii="Times" w:eastAsia="Times" w:hAnsi="Times" w:cs="Times"/>
+                <w:lang w:eastAsia="zh-TW"/>
+              </w:rPr>
+              <w:t xml:space="preserve"> partial to 6</w:t>
+            </w:r>
+            <w:r>
+              <w:rPr>
+                <w:rFonts w:ascii="Times" w:eastAsia="Times" w:hAnsi="Times" w:cs="Times"/>
+                <w:vertAlign w:val="superscript"/>
+                <w:lang w:eastAsia="zh-TW"/>
+              </w:rPr>
+              <w:t>th</w:t>
+            </w:r>
+            <w:r>
+              <w:rPr>
+                <w:rFonts w:ascii="Times" w:eastAsia="Times" w:hAnsi="Times" w:cs="Times"/>
+                <w:lang w:eastAsia="zh-TW"/>
+              </w:rPr>
+              <w:t xml:space="preserve"> partial on sul G</w:t>
+            </w:r>
+          </w:p>
+        </w:tc>
+        <w:tc>
+          <w:tcPr>
+            <w:tcW w:w="2994" w:type="dxa"/>
+            <w:vAlign w:val="center"/>
+          </w:tcPr>
+          <w:p>
+            <w:pPr>
+              <w:jc w:val="center"/>
+              <w:rPr>
+                <w:rFonts w:ascii="Times New Roman" w:hAnsi="Times New Roman" w:cs="Times New Roman"/>
+                <w:color w:val="FF0000"/>
+                <w:lang w:eastAsia="zh-TW"/>
+              </w:rPr>
+            </w:pPr>
+          </w:p>
+        </w:tc>
+      </w:tr>
+      <w:tr>
+        <w:trPr>
+          <w:trHeight w:val="552"/>
+        </w:trPr>
+        <w:tc>
+          <w:tcPr>
+            <w:tcW w:w="1129" w:type="dxa"/>
+          </w:tcPr>
+          <w:p>
+            <w:pPr>
+              <w:jc w:val="center"/>
+              <w:rPr>
+                <w:rFonts w:ascii="Times" w:eastAsia="Times" w:hAnsi="Times" w:cs="Times"/>
+                <w:lang w:eastAsia="zh-TW"/>
+              </w:rPr>
+            </w:pPr>
+            <w:r>
+              <w:rPr>
+                <w:rFonts w:ascii="Times" w:eastAsia="Times" w:hAnsi="Times" w:cs="Times"/>
+                <w:lang w:eastAsia="zh-TW"/>
+              </w:rPr>
+              <w:t>293</w:t>
+            </w:r>
+          </w:p>
+        </w:tc>
+        <w:tc>
+          <w:tcPr>
+            <w:tcW w:w="1985" w:type="dxa"/>
+          </w:tcPr>
+          <w:p>
+            <w:pPr>
+              <w:jc w:val="center"/>
+              <w:rPr>
+                <w:rFonts w:ascii="Times" w:eastAsia="Times" w:hAnsi="Times" w:cs="Times"/>
                 <w:lang w:eastAsia="zh-TW"/>
               </w:rPr>
             </w:pPr>
@@ -2160,31 +2227,13 @@
               </w:rPr>
               <w:t xml:space="preserve">GH, EH, ZH, </w:t>
             </w:r>
-            <w:proofErr w:type="spellStart"/>
-            <w:r>
-              <w:rPr>
-                <w:rFonts w:ascii="Times" w:eastAsia="Times" w:hAnsi="Times" w:cs="Times"/>
-                <w:lang w:eastAsia="zh-TW"/>
-              </w:rPr>
-              <w:t>Vc</w:t>
-            </w:r>
-            <w:proofErr w:type="spellEnd"/>
-            <w:r>
-              <w:rPr>
-                <w:rFonts w:ascii="Times" w:eastAsia="Times" w:hAnsi="Times" w:cs="Times"/>
-                <w:lang w:eastAsia="zh-TW"/>
-              </w:rPr>
-              <w:t xml:space="preserve">, </w:t>
-            </w:r>
-            <w:proofErr w:type="spellStart"/>
-            <w:r>
-              <w:rPr>
-                <w:rFonts w:ascii="Times" w:eastAsia="Times" w:hAnsi="Times" w:cs="Times"/>
-                <w:lang w:eastAsia="zh-TW"/>
-              </w:rPr>
-              <w:t>Cb</w:t>
-            </w:r>
-            <w:proofErr w:type="spellEnd"/>
+            <w:r>
+              <w:rPr>
+                <w:rFonts w:ascii="Times" w:eastAsia="Times" w:hAnsi="Times" w:cs="Times"/>
+                <w:lang w:eastAsia="zh-TW"/>
+              </w:rPr>
+              <w:t>Vc, Cb</w:t>
+            </w:r>
           </w:p>
         </w:tc>
         <w:tc>

</xml_diff>

<commit_message>
Minor edit to 7 and publishing of v1 PDF
</commit_message>
<xml_diff>
--- a/Working Folder/7 Gordon Fung 冯迪伦 - Arise, You Lion of Glory! 狮舞弄清韻/7 Gordon Fung 冯迪伦 - Arise, You Lion of Glory! 狮舞弄清韻 - Errata_v1.docx
+++ b/Working Folder/7 Gordon Fung 冯迪伦 - Arise, You Lion of Glory! 狮舞弄清韻/7 Gordon Fung 冯迪伦 - Arise, You Lion of Glory! 狮舞弄清韻 - Errata_v1.docx
@@ -1265,7 +1265,23 @@
                 <w:rFonts w:ascii="Times" w:eastAsia="Times" w:hAnsi="Times" w:cs="Times"/>
                 <w:lang w:eastAsia="zh-TW"/>
               </w:rPr>
-              <w:t>Tempo 60 = tuplet?</w:t>
+              <w:t xml:space="preserve">Tempo 60 = </w:t>
+            </w:r>
+            <w:proofErr w:type="spellStart"/>
+            <w:r>
+              <w:rPr>
+                <w:rFonts w:ascii="Times" w:eastAsia="Times" w:hAnsi="Times" w:cs="Times"/>
+                <w:lang w:eastAsia="zh-TW"/>
+              </w:rPr>
+              <w:t>tuplet</w:t>
+            </w:r>
+            <w:proofErr w:type="spellEnd"/>
+            <w:r>
+              <w:rPr>
+                <w:rFonts w:ascii="Times" w:eastAsia="Times" w:hAnsi="Times" w:cs="Times"/>
+                <w:lang w:eastAsia="zh-TW"/>
+              </w:rPr>
+              <w:t>?</w:t>
             </w:r>
           </w:p>
         </w:tc>
@@ -1368,6 +1384,7 @@
               </w:rPr>
               <w:t xml:space="preserve"> </w:t>
             </w:r>
+            <w:proofErr w:type="spellStart"/>
             <w:r>
               <w:rPr>
                 <w:rFonts w:ascii="Times" w:eastAsiaTheme="minorEastAsia" w:hAnsi="Times" w:cs="Times"/>
@@ -1378,6 +1395,7 @@
               </w:rPr>
               <w:t>sfz</w:t>
             </w:r>
+            <w:proofErr w:type="spellEnd"/>
             <w:r>
               <w:rPr>
                 <w:rFonts w:ascii="Times" w:eastAsiaTheme="minorEastAsia" w:hAnsi="Times" w:cs="Times"/>
@@ -1585,7 +1603,7 @@
             <w:pPr>
               <w:jc w:val="center"/>
               <w:rPr>
-                <w:rFonts w:ascii="Times" w:eastAsiaTheme="minorEastAsia" w:hAnsi="Times" w:cs="Times" w:hint="eastAsia"/>
+                <w:rFonts w:ascii="Times" w:eastAsiaTheme="minorEastAsia" w:hAnsi="Times" w:cs="Times"/>
               </w:rPr>
             </w:pPr>
             <w:r>
@@ -1604,7 +1622,7 @@
             <w:pPr>
               <w:jc w:val="center"/>
               <w:rPr>
-                <w:rFonts w:ascii="Times" w:eastAsiaTheme="minorEastAsia" w:hAnsi="Times" w:cs="Times" w:hint="eastAsia"/>
+                <w:rFonts w:ascii="Times" w:eastAsiaTheme="minorEastAsia" w:hAnsi="Times" w:cs="Times"/>
               </w:rPr>
             </w:pPr>
             <w:r>
@@ -1622,7 +1640,7 @@
           <w:p>
             <w:pPr>
               <w:rPr>
-                <w:rFonts w:ascii="Times" w:eastAsiaTheme="minorEastAsia" w:hAnsi="Times" w:cs="Times" w:hint="eastAsia"/>
+                <w:rFonts w:ascii="Times" w:eastAsiaTheme="minorEastAsia" w:hAnsi="Times" w:cs="Times"/>
               </w:rPr>
             </w:pPr>
             <w:r>
@@ -1662,7 +1680,7 @@
             <w:pPr>
               <w:jc w:val="center"/>
               <w:rPr>
-                <w:rFonts w:ascii="Times" w:eastAsiaTheme="minorEastAsia" w:hAnsi="Times" w:cs="Times" w:hint="eastAsia"/>
+                <w:rFonts w:ascii="Times" w:eastAsiaTheme="minorEastAsia" w:hAnsi="Times" w:cs="Times"/>
               </w:rPr>
             </w:pPr>
             <w:r>
@@ -1681,15 +1699,23 @@
             <w:pPr>
               <w:jc w:val="center"/>
               <w:rPr>
-                <w:rFonts w:ascii="Times" w:eastAsiaTheme="minorEastAsia" w:hAnsi="Times" w:cs="Times" w:hint="eastAsia"/>
-              </w:rPr>
-            </w:pPr>
-            <w:r>
-              <w:rPr>
-                <w:rFonts w:ascii="Times" w:eastAsiaTheme="minorEastAsia" w:hAnsi="Times" w:cs="Times"/>
-              </w:rPr>
-              <w:t>XD, GYSh</w:t>
-            </w:r>
+                <w:rFonts w:ascii="Times" w:eastAsiaTheme="minorEastAsia" w:hAnsi="Times" w:cs="Times"/>
+              </w:rPr>
+            </w:pPr>
+            <w:r>
+              <w:rPr>
+                <w:rFonts w:ascii="Times" w:eastAsiaTheme="minorEastAsia" w:hAnsi="Times" w:cs="Times"/>
+              </w:rPr>
+              <w:t xml:space="preserve">XD, </w:t>
+            </w:r>
+            <w:proofErr w:type="spellStart"/>
+            <w:r>
+              <w:rPr>
+                <w:rFonts w:ascii="Times" w:eastAsiaTheme="minorEastAsia" w:hAnsi="Times" w:cs="Times"/>
+              </w:rPr>
+              <w:t>GYSh</w:t>
+            </w:r>
+            <w:proofErr w:type="spellEnd"/>
           </w:p>
         </w:tc>
         <w:tc>
@@ -1699,7 +1725,7 @@
           <w:p>
             <w:pPr>
               <w:rPr>
-                <w:rFonts w:ascii="Times" w:eastAsiaTheme="minorEastAsia" w:hAnsi="Times" w:cs="Times" w:hint="eastAsia"/>
+                <w:rFonts w:ascii="Times" w:eastAsiaTheme="minorEastAsia" w:hAnsi="Times" w:cs="Times"/>
               </w:rPr>
             </w:pPr>
             <w:r>
@@ -1755,7 +1781,7 @@
             <w:pPr>
               <w:jc w:val="center"/>
               <w:rPr>
-                <w:rFonts w:ascii="Times" w:eastAsiaTheme="minorEastAsia" w:hAnsi="Times" w:cs="Times" w:hint="eastAsia"/>
+                <w:rFonts w:ascii="Times" w:eastAsiaTheme="minorEastAsia" w:hAnsi="Times" w:cs="Times"/>
               </w:rPr>
             </w:pPr>
             <w:r>
@@ -1774,7 +1800,7 @@
             <w:pPr>
               <w:jc w:val="center"/>
               <w:rPr>
-                <w:rFonts w:ascii="Times" w:eastAsiaTheme="minorEastAsia" w:hAnsi="Times" w:cs="Times" w:hint="eastAsia"/>
+                <w:rFonts w:ascii="Times" w:eastAsiaTheme="minorEastAsia" w:hAnsi="Times" w:cs="Times"/>
               </w:rPr>
             </w:pPr>
             <w:r>
@@ -1792,7 +1818,7 @@
           <w:p>
             <w:pPr>
               <w:rPr>
-                <w:rFonts w:ascii="Times" w:eastAsiaTheme="minorEastAsia" w:hAnsi="Times" w:cs="Times" w:hint="eastAsia"/>
+                <w:rFonts w:ascii="Times" w:eastAsiaTheme="minorEastAsia" w:hAnsi="Times" w:cs="Times"/>
               </w:rPr>
             </w:pPr>
             <w:r>
@@ -2132,7 +2158,23 @@
                 <w:rFonts w:ascii="Times" w:eastAsia="Times" w:hAnsi="Times" w:cs="Times"/>
                 <w:lang w:eastAsia="zh-TW"/>
               </w:rPr>
-              <w:t>Edited sul D 8</w:t>
+              <w:t xml:space="preserve">Edited </w:t>
+            </w:r>
+            <w:proofErr w:type="spellStart"/>
+            <w:r>
+              <w:rPr>
+                <w:rFonts w:ascii="Times" w:eastAsia="Times" w:hAnsi="Times" w:cs="Times"/>
+                <w:lang w:eastAsia="zh-TW"/>
+              </w:rPr>
+              <w:t>sul</w:t>
+            </w:r>
+            <w:proofErr w:type="spellEnd"/>
+            <w:r>
+              <w:rPr>
+                <w:rFonts w:ascii="Times" w:eastAsia="Times" w:hAnsi="Times" w:cs="Times"/>
+                <w:lang w:eastAsia="zh-TW"/>
+              </w:rPr>
+              <w:t xml:space="preserve"> D 8</w:t>
             </w:r>
             <w:r>
               <w:rPr>
@@ -2162,7 +2204,23 @@
                 <w:rFonts w:ascii="Times" w:eastAsia="Times" w:hAnsi="Times" w:cs="Times"/>
                 <w:lang w:eastAsia="zh-TW"/>
               </w:rPr>
-              <w:t xml:space="preserve"> partial on sul G</w:t>
+              <w:t xml:space="preserve"> partial on </w:t>
+            </w:r>
+            <w:proofErr w:type="spellStart"/>
+            <w:r>
+              <w:rPr>
+                <w:rFonts w:ascii="Times" w:eastAsia="Times" w:hAnsi="Times" w:cs="Times"/>
+                <w:lang w:eastAsia="zh-TW"/>
+              </w:rPr>
+              <w:t>sul</w:t>
+            </w:r>
+            <w:proofErr w:type="spellEnd"/>
+            <w:r>
+              <w:rPr>
+                <w:rFonts w:ascii="Times" w:eastAsia="Times" w:hAnsi="Times" w:cs="Times"/>
+                <w:lang w:eastAsia="zh-TW"/>
+              </w:rPr>
+              <w:t xml:space="preserve"> G</w:t>
             </w:r>
           </w:p>
         </w:tc>
@@ -2227,13 +2285,31 @@
               </w:rPr>
               <w:t xml:space="preserve">GH, EH, ZH, </w:t>
             </w:r>
-            <w:r>
-              <w:rPr>
-                <w:rFonts w:ascii="Times" w:eastAsia="Times" w:hAnsi="Times" w:cs="Times"/>
-                <w:lang w:eastAsia="zh-TW"/>
-              </w:rPr>
-              <w:t>Vc, Cb</w:t>
-            </w:r>
+            <w:proofErr w:type="spellStart"/>
+            <w:r>
+              <w:rPr>
+                <w:rFonts w:ascii="Times" w:eastAsia="Times" w:hAnsi="Times" w:cs="Times"/>
+                <w:lang w:eastAsia="zh-TW"/>
+              </w:rPr>
+              <w:t>Vc</w:t>
+            </w:r>
+            <w:proofErr w:type="spellEnd"/>
+            <w:r>
+              <w:rPr>
+                <w:rFonts w:ascii="Times" w:eastAsia="Times" w:hAnsi="Times" w:cs="Times"/>
+                <w:lang w:eastAsia="zh-TW"/>
+              </w:rPr>
+              <w:t xml:space="preserve">, </w:t>
+            </w:r>
+            <w:proofErr w:type="spellStart"/>
+            <w:r>
+              <w:rPr>
+                <w:rFonts w:ascii="Times" w:eastAsia="Times" w:hAnsi="Times" w:cs="Times"/>
+                <w:lang w:eastAsia="zh-TW"/>
+              </w:rPr>
+              <w:t>Cb</w:t>
+            </w:r>
+            <w:proofErr w:type="spellEnd"/>
           </w:p>
         </w:tc>
         <w:tc>
@@ -2254,440 +2330,6 @@
               </w:rPr>
               <w:t>Simplified harmonics to save space and reduce ledger lines.</w:t>
             </w:r>
-          </w:p>
-        </w:tc>
-        <w:tc>
-          <w:tcPr>
-            <w:tcW w:w="2994" w:type="dxa"/>
-            <w:vAlign w:val="center"/>
-          </w:tcPr>
-          <w:p>
-            <w:pPr>
-              <w:jc w:val="center"/>
-              <w:rPr>
-                <w:rFonts w:ascii="Times New Roman" w:hAnsi="Times New Roman" w:cs="Times New Roman"/>
-                <w:color w:val="FF0000"/>
-                <w:lang w:eastAsia="zh-TW"/>
-              </w:rPr>
-            </w:pPr>
-          </w:p>
-        </w:tc>
-      </w:tr>
-      <w:tr>
-        <w:trPr>
-          <w:trHeight w:val="552"/>
-        </w:trPr>
-        <w:tc>
-          <w:tcPr>
-            <w:tcW w:w="1129" w:type="dxa"/>
-          </w:tcPr>
-          <w:p>
-            <w:pPr>
-              <w:jc w:val="center"/>
-              <w:rPr>
-                <w:rFonts w:ascii="Times" w:eastAsia="Times" w:hAnsi="Times" w:cs="Times"/>
-                <w:lang w:eastAsia="zh-TW"/>
-              </w:rPr>
-            </w:pPr>
-          </w:p>
-        </w:tc>
-        <w:tc>
-          <w:tcPr>
-            <w:tcW w:w="1985" w:type="dxa"/>
-          </w:tcPr>
-          <w:p>
-            <w:pPr>
-              <w:jc w:val="center"/>
-              <w:rPr>
-                <w:rFonts w:ascii="Times" w:eastAsia="Times" w:hAnsi="Times" w:cs="Times"/>
-                <w:lang w:eastAsia="zh-TW"/>
-              </w:rPr>
-            </w:pPr>
-          </w:p>
-        </w:tc>
-        <w:tc>
-          <w:tcPr>
-            <w:tcW w:w="2977" w:type="dxa"/>
-          </w:tcPr>
-          <w:p>
-            <w:pPr>
-              <w:rPr>
-                <w:rFonts w:ascii="Times" w:eastAsia="Times" w:hAnsi="Times" w:cs="Times"/>
-                <w:lang w:eastAsia="zh-TW"/>
-              </w:rPr>
-            </w:pPr>
-          </w:p>
-        </w:tc>
-        <w:tc>
-          <w:tcPr>
-            <w:tcW w:w="2994" w:type="dxa"/>
-            <w:vAlign w:val="center"/>
-          </w:tcPr>
-          <w:p>
-            <w:pPr>
-              <w:jc w:val="center"/>
-              <w:rPr>
-                <w:rFonts w:ascii="Times New Roman" w:hAnsi="Times New Roman" w:cs="Times New Roman"/>
-                <w:color w:val="FF0000"/>
-                <w:lang w:eastAsia="zh-TW"/>
-              </w:rPr>
-            </w:pPr>
-          </w:p>
-        </w:tc>
-      </w:tr>
-      <w:tr>
-        <w:trPr>
-          <w:trHeight w:val="552"/>
-        </w:trPr>
-        <w:tc>
-          <w:tcPr>
-            <w:tcW w:w="1129" w:type="dxa"/>
-          </w:tcPr>
-          <w:p>
-            <w:pPr>
-              <w:jc w:val="center"/>
-              <w:rPr>
-                <w:rFonts w:ascii="Times" w:eastAsia="Times" w:hAnsi="Times" w:cs="Times"/>
-                <w:lang w:eastAsia="zh-TW"/>
-              </w:rPr>
-            </w:pPr>
-          </w:p>
-        </w:tc>
-        <w:tc>
-          <w:tcPr>
-            <w:tcW w:w="1985" w:type="dxa"/>
-          </w:tcPr>
-          <w:p>
-            <w:pPr>
-              <w:jc w:val="center"/>
-              <w:rPr>
-                <w:rFonts w:ascii="Times" w:eastAsia="Times" w:hAnsi="Times" w:cs="Times"/>
-                <w:lang w:eastAsia="zh-TW"/>
-              </w:rPr>
-            </w:pPr>
-          </w:p>
-        </w:tc>
-        <w:tc>
-          <w:tcPr>
-            <w:tcW w:w="2977" w:type="dxa"/>
-          </w:tcPr>
-          <w:p>
-            <w:pPr>
-              <w:rPr>
-                <w:rFonts w:ascii="Times" w:eastAsia="Times" w:hAnsi="Times" w:cs="Times"/>
-                <w:lang w:eastAsia="zh-TW"/>
-              </w:rPr>
-            </w:pPr>
-          </w:p>
-        </w:tc>
-        <w:tc>
-          <w:tcPr>
-            <w:tcW w:w="2994" w:type="dxa"/>
-            <w:vAlign w:val="center"/>
-          </w:tcPr>
-          <w:p>
-            <w:pPr>
-              <w:jc w:val="center"/>
-              <w:rPr>
-                <w:rFonts w:ascii="Times New Roman" w:hAnsi="Times New Roman" w:cs="Times New Roman"/>
-                <w:color w:val="FF0000"/>
-                <w:lang w:eastAsia="zh-TW"/>
-              </w:rPr>
-            </w:pPr>
-          </w:p>
-        </w:tc>
-      </w:tr>
-      <w:tr>
-        <w:trPr>
-          <w:trHeight w:val="552"/>
-        </w:trPr>
-        <w:tc>
-          <w:tcPr>
-            <w:tcW w:w="1129" w:type="dxa"/>
-          </w:tcPr>
-          <w:p>
-            <w:pPr>
-              <w:jc w:val="center"/>
-              <w:rPr>
-                <w:rFonts w:ascii="Times" w:eastAsia="Times" w:hAnsi="Times" w:cs="Times"/>
-                <w:lang w:eastAsia="zh-TW"/>
-              </w:rPr>
-            </w:pPr>
-          </w:p>
-        </w:tc>
-        <w:tc>
-          <w:tcPr>
-            <w:tcW w:w="1985" w:type="dxa"/>
-          </w:tcPr>
-          <w:p>
-            <w:pPr>
-              <w:jc w:val="center"/>
-              <w:rPr>
-                <w:rFonts w:ascii="Times" w:eastAsia="Times" w:hAnsi="Times" w:cs="Times"/>
-                <w:lang w:eastAsia="zh-TW"/>
-              </w:rPr>
-            </w:pPr>
-          </w:p>
-        </w:tc>
-        <w:tc>
-          <w:tcPr>
-            <w:tcW w:w="2977" w:type="dxa"/>
-          </w:tcPr>
-          <w:p>
-            <w:pPr>
-              <w:rPr>
-                <w:rFonts w:ascii="Times" w:eastAsia="Times" w:hAnsi="Times" w:cs="Times"/>
-                <w:lang w:eastAsia="zh-TW"/>
-              </w:rPr>
-            </w:pPr>
-          </w:p>
-        </w:tc>
-        <w:tc>
-          <w:tcPr>
-            <w:tcW w:w="2994" w:type="dxa"/>
-            <w:vAlign w:val="center"/>
-          </w:tcPr>
-          <w:p>
-            <w:pPr>
-              <w:jc w:val="center"/>
-              <w:rPr>
-                <w:rFonts w:ascii="Times New Roman" w:hAnsi="Times New Roman" w:cs="Times New Roman"/>
-                <w:color w:val="FF0000"/>
-                <w:lang w:eastAsia="zh-TW"/>
-              </w:rPr>
-            </w:pPr>
-          </w:p>
-        </w:tc>
-      </w:tr>
-      <w:tr>
-        <w:trPr>
-          <w:trHeight w:val="552"/>
-        </w:trPr>
-        <w:tc>
-          <w:tcPr>
-            <w:tcW w:w="1129" w:type="dxa"/>
-          </w:tcPr>
-          <w:p>
-            <w:pPr>
-              <w:jc w:val="center"/>
-              <w:rPr>
-                <w:rFonts w:ascii="Times" w:eastAsia="Times" w:hAnsi="Times" w:cs="Times"/>
-                <w:lang w:eastAsia="zh-TW"/>
-              </w:rPr>
-            </w:pPr>
-          </w:p>
-        </w:tc>
-        <w:tc>
-          <w:tcPr>
-            <w:tcW w:w="1985" w:type="dxa"/>
-          </w:tcPr>
-          <w:p>
-            <w:pPr>
-              <w:jc w:val="center"/>
-              <w:rPr>
-                <w:rFonts w:ascii="Times" w:eastAsia="Times" w:hAnsi="Times" w:cs="Times"/>
-                <w:lang w:eastAsia="zh-TW"/>
-              </w:rPr>
-            </w:pPr>
-          </w:p>
-        </w:tc>
-        <w:tc>
-          <w:tcPr>
-            <w:tcW w:w="2977" w:type="dxa"/>
-          </w:tcPr>
-          <w:p>
-            <w:pPr>
-              <w:rPr>
-                <w:rFonts w:ascii="Times" w:eastAsia="Times" w:hAnsi="Times" w:cs="Times"/>
-                <w:lang w:eastAsia="zh-TW"/>
-              </w:rPr>
-            </w:pPr>
-          </w:p>
-        </w:tc>
-        <w:tc>
-          <w:tcPr>
-            <w:tcW w:w="2994" w:type="dxa"/>
-            <w:vAlign w:val="center"/>
-          </w:tcPr>
-          <w:p>
-            <w:pPr>
-              <w:jc w:val="center"/>
-              <w:rPr>
-                <w:rFonts w:ascii="Times New Roman" w:hAnsi="Times New Roman" w:cs="Times New Roman"/>
-                <w:color w:val="FF0000"/>
-                <w:lang w:eastAsia="zh-TW"/>
-              </w:rPr>
-            </w:pPr>
-          </w:p>
-        </w:tc>
-      </w:tr>
-      <w:tr>
-        <w:trPr>
-          <w:trHeight w:val="552"/>
-        </w:trPr>
-        <w:tc>
-          <w:tcPr>
-            <w:tcW w:w="1129" w:type="dxa"/>
-          </w:tcPr>
-          <w:p>
-            <w:pPr>
-              <w:jc w:val="center"/>
-              <w:rPr>
-                <w:rFonts w:ascii="Times" w:eastAsia="Times" w:hAnsi="Times" w:cs="Times"/>
-                <w:lang w:eastAsia="zh-TW"/>
-              </w:rPr>
-            </w:pPr>
-          </w:p>
-        </w:tc>
-        <w:tc>
-          <w:tcPr>
-            <w:tcW w:w="1985" w:type="dxa"/>
-          </w:tcPr>
-          <w:p>
-            <w:pPr>
-              <w:jc w:val="center"/>
-              <w:rPr>
-                <w:rFonts w:ascii="MS Mincho" w:eastAsia="MS Mincho" w:hAnsi="MS Mincho" w:cs="MS Mincho"/>
-                <w:lang w:val="en-US" w:eastAsia="zh-TW"/>
-              </w:rPr>
-            </w:pPr>
-          </w:p>
-        </w:tc>
-        <w:tc>
-          <w:tcPr>
-            <w:tcW w:w="2977" w:type="dxa"/>
-          </w:tcPr>
-          <w:p>
-            <w:pPr>
-              <w:rPr>
-                <w:rFonts w:ascii="Times" w:eastAsia="Times" w:hAnsi="Times" w:cs="Times"/>
-                <w:lang w:eastAsia="zh-TW"/>
-              </w:rPr>
-            </w:pPr>
-          </w:p>
-        </w:tc>
-        <w:tc>
-          <w:tcPr>
-            <w:tcW w:w="2994" w:type="dxa"/>
-            <w:vAlign w:val="center"/>
-          </w:tcPr>
-          <w:p>
-            <w:pPr>
-              <w:jc w:val="center"/>
-              <w:rPr>
-                <w:rFonts w:ascii="Times New Roman" w:hAnsi="Times New Roman" w:cs="Times New Roman"/>
-                <w:color w:val="FF0000"/>
-                <w:lang w:eastAsia="zh-TW"/>
-              </w:rPr>
-            </w:pPr>
-          </w:p>
-        </w:tc>
-      </w:tr>
-      <w:tr>
-        <w:trPr>
-          <w:trHeight w:val="552"/>
-        </w:trPr>
-        <w:tc>
-          <w:tcPr>
-            <w:tcW w:w="1129" w:type="dxa"/>
-          </w:tcPr>
-          <w:p>
-            <w:pPr>
-              <w:jc w:val="center"/>
-              <w:rPr>
-                <w:rFonts w:ascii="Times" w:eastAsia="Times" w:hAnsi="Times" w:cs="Times"/>
-                <w:lang w:eastAsia="zh-TW"/>
-              </w:rPr>
-            </w:pPr>
-          </w:p>
-        </w:tc>
-        <w:tc>
-          <w:tcPr>
-            <w:tcW w:w="1985" w:type="dxa"/>
-          </w:tcPr>
-          <w:p>
-            <w:pPr>
-              <w:jc w:val="center"/>
-              <w:rPr>
-                <w:rFonts w:ascii="Times" w:eastAsia="Times" w:hAnsi="Times" w:cs="Times"/>
-                <w:lang w:eastAsia="zh-TW"/>
-              </w:rPr>
-            </w:pPr>
-          </w:p>
-        </w:tc>
-        <w:tc>
-          <w:tcPr>
-            <w:tcW w:w="2977" w:type="dxa"/>
-          </w:tcPr>
-          <w:p>
-            <w:pPr>
-              <w:rPr>
-                <w:rFonts w:ascii="Times" w:eastAsia="Times" w:hAnsi="Times" w:cs="Times"/>
-                <w:lang w:eastAsia="zh-TW"/>
-              </w:rPr>
-            </w:pPr>
-          </w:p>
-        </w:tc>
-        <w:tc>
-          <w:tcPr>
-            <w:tcW w:w="2994" w:type="dxa"/>
-            <w:vAlign w:val="center"/>
-          </w:tcPr>
-          <w:p>
-            <w:pPr>
-              <w:jc w:val="center"/>
-              <w:rPr>
-                <w:rFonts w:ascii="Times New Roman" w:hAnsi="Times New Roman" w:cs="Times New Roman"/>
-                <w:color w:val="FF0000"/>
-                <w:lang w:eastAsia="zh-TW"/>
-              </w:rPr>
-            </w:pPr>
-          </w:p>
-        </w:tc>
-      </w:tr>
-      <w:tr>
-        <w:trPr>
-          <w:trHeight w:val="552"/>
-        </w:trPr>
-        <w:tc>
-          <w:tcPr>
-            <w:tcW w:w="1129" w:type="dxa"/>
-          </w:tcPr>
-          <w:p>
-            <w:pPr>
-              <w:jc w:val="center"/>
-              <w:rPr>
-                <w:rFonts w:ascii="Times" w:eastAsia="Times" w:hAnsi="Times" w:cs="Times"/>
-                <w:lang w:eastAsia="zh-TW"/>
-              </w:rPr>
-            </w:pPr>
-          </w:p>
-        </w:tc>
-        <w:tc>
-          <w:tcPr>
-            <w:tcW w:w="1985" w:type="dxa"/>
-          </w:tcPr>
-          <w:p>
-            <w:pPr>
-              <w:jc w:val="center"/>
-              <w:rPr>
-                <w:rFonts w:ascii="MS Mincho" w:eastAsia="MS Mincho" w:hAnsi="MS Mincho" w:cs="MS Mincho"/>
-                <w:lang w:val="en-US" w:eastAsia="zh-TW"/>
-              </w:rPr>
-            </w:pPr>
-          </w:p>
-        </w:tc>
-        <w:tc>
-          <w:tcPr>
-            <w:tcW w:w="2977" w:type="dxa"/>
-          </w:tcPr>
-          <w:p>
-            <w:pPr>
-              <w:rPr>
-                <w:rFonts w:ascii="Times" w:eastAsia="Times" w:hAnsi="Times" w:cs="Times"/>
-                <w:lang w:eastAsia="zh-TW"/>
-              </w:rPr>
-            </w:pPr>
           </w:p>
         </w:tc>
         <w:tc>

</xml_diff>